<commit_message>
docs: update data workflow control strategy
</commit_message>
<xml_diff>
--- a/docs/architecture/team-1/data-workflow-control-strategy.docx
+++ b/docs/architecture/team-1/data-workflow-control-strategy.docx
@@ -47,10 +47,10 @@
           <w:lang w:val="vi-VN"/>
         </w:rPr>
         <w:drawing>
-          <wp:inline distT="0" distB="0" distL="0" distR="0" wp14:anchorId="64F910BE" wp14:editId="0BF966C1">
-            <wp:extent cx="4391025" cy="2009775"/>
+          <wp:inline distT="0" distB="0" distL="0" distR="0" wp14:anchorId="19D69882" wp14:editId="0D7D0518">
+            <wp:extent cx="4391025" cy="2676525"/>
             <wp:effectExtent l="0" t="0" r="9525" b="9525"/>
-            <wp:docPr id="447964634" name="Picture 1"/>
+            <wp:docPr id="2077111653" name="Picture 1"/>
             <wp:cNvGraphicFramePr>
               <a:graphicFrameLocks xmlns:a="http://schemas.openxmlformats.org/drawingml/2006/main" noChangeAspect="1"/>
             </wp:cNvGraphicFramePr>
@@ -58,7 +58,7 @@
               <a:graphicData uri="http://schemas.openxmlformats.org/drawingml/2006/picture">
                 <pic:pic xmlns:pic="http://schemas.openxmlformats.org/drawingml/2006/picture">
                   <pic:nvPicPr>
-                    <pic:cNvPr id="447964634" name="Picture 447964634"/>
+                    <pic:cNvPr id="2077111653" name="Picture 2077111653"/>
                     <pic:cNvPicPr/>
                   </pic:nvPicPr>
                   <pic:blipFill>
@@ -76,7 +76,7 @@
                   <pic:spPr>
                     <a:xfrm>
                       <a:off x="0" y="0"/>
-                      <a:ext cx="4391025" cy="2009775"/>
+                      <a:ext cx="4391025" cy="2676525"/>
                     </a:xfrm>
                     <a:prstGeom prst="rect">
                       <a:avLst/>
@@ -124,6 +124,7 @@
           <w:rFonts w:ascii="Times New Roman" w:hAnsi="Times New Roman" w:cs="Times New Roman"/>
           <w:sz w:val="26"/>
           <w:szCs w:val="26"/>
+          <w:lang w:val="vi-VN"/>
         </w:rPr>
       </w:pPr>
       <w:r>
@@ -839,6 +840,9 @@
         </w:tc>
       </w:tr>
       <w:tr>
+        <w:trPr>
+          <w:cantSplit/>
+        </w:trPr>
         <w:tc>
           <w:tcPr>
             <w:tcW w:w="3116" w:type="dxa"/>
@@ -933,6 +937,7 @@
                 <w:sz w:val="26"/>
                 <w:szCs w:val="26"/>
               </w:rPr>
+              <w:lastRenderedPageBreak/>
               <w:t>silver_transform_name</w:t>
             </w:r>
           </w:p>
@@ -1007,7 +1012,6 @@
                 <w:sz w:val="26"/>
                 <w:szCs w:val="26"/>
               </w:rPr>
-              <w:lastRenderedPageBreak/>
               <w:t>watermark_column</w:t>
             </w:r>
           </w:p>
@@ -1549,18 +1553,7 @@
           <w:szCs w:val="26"/>
           <w:lang w:val="vi-VN"/>
         </w:rPr>
-        <w:t>fg.dim_fact_</w:t>
-      </w:r>
-      <w:r>
-        <w:rPr>
-          <w:rFonts w:ascii="Times New Roman" w:hAnsi="Times New Roman" w:cs="Times New Roman"/>
-          <w:b/>
-          <w:bCs/>
-          <w:sz w:val="26"/>
-          <w:szCs w:val="26"/>
-          <w:lang w:val="vi-VN"/>
-        </w:rPr>
-        <w:t>table</w:t>
+        <w:t>fg.dim_fact_table</w:t>
       </w:r>
     </w:p>
     <w:p>
@@ -1591,16 +1584,7 @@
           <w:szCs w:val="26"/>
           <w:lang w:val="vi-VN"/>
         </w:rPr>
-        <w:t xml:space="preserve"> Stores metadata for Gold layer dimension and fact </w:t>
-      </w:r>
-      <w:r>
-        <w:rPr>
-          <w:rFonts w:ascii="Times New Roman" w:hAnsi="Times New Roman" w:cs="Times New Roman"/>
-          <w:sz w:val="26"/>
-          <w:szCs w:val="26"/>
-          <w:lang w:val="vi-VN"/>
-        </w:rPr>
-        <w:t>tables.</w:t>
+        <w:t xml:space="preserve"> Stores metadata for Gold layer dimension and fact tables.</w:t>
       </w:r>
     </w:p>
     <w:tbl>
@@ -2370,6 +2354,36 @@
     </w:p>
     <w:p>
       <w:pPr>
+        <w:rPr>
+          <w:rFonts w:ascii="Times New Roman" w:hAnsi="Times New Roman" w:cs="Times New Roman"/>
+          <w:sz w:val="26"/>
+          <w:szCs w:val="26"/>
+          <w:lang w:val="vi-VN"/>
+        </w:rPr>
+      </w:pPr>
+    </w:p>
+    <w:p>
+      <w:pPr>
+        <w:rPr>
+          <w:rFonts w:ascii="Times New Roman" w:hAnsi="Times New Roman" w:cs="Times New Roman"/>
+          <w:sz w:val="26"/>
+          <w:szCs w:val="26"/>
+          <w:lang w:val="vi-VN"/>
+        </w:rPr>
+      </w:pPr>
+    </w:p>
+    <w:p>
+      <w:pPr>
+        <w:rPr>
+          <w:rFonts w:ascii="Times New Roman" w:hAnsi="Times New Roman" w:cs="Times New Roman"/>
+          <w:sz w:val="26"/>
+          <w:szCs w:val="26"/>
+          <w:lang w:val="vi-VN"/>
+        </w:rPr>
+      </w:pPr>
+    </w:p>
+    <w:p>
+      <w:pPr>
         <w:pStyle w:val="ListParagraph"/>
         <w:numPr>
           <w:ilvl w:val="1"/>
@@ -2424,7 +2438,25 @@
           <w:szCs w:val="26"/>
           <w:lang w:val="vi-VN"/>
         </w:rPr>
-        <w:t xml:space="preserve"> Stores incremental processing checkpoints for Bronze and Silver layers.</w:t>
+        <w:t xml:space="preserve"> </w:t>
+      </w:r>
+      <w:r>
+        <w:rPr>
+          <w:rFonts w:ascii="Times New Roman" w:hAnsi="Times New Roman" w:cs="Times New Roman"/>
+          <w:sz w:val="26"/>
+          <w:szCs w:val="26"/>
+          <w:lang w:val="vi-VN"/>
+        </w:rPr>
+        <w:t>Stores the latest source watermark value used for incremental extraction from Source to Bronze</w:t>
+      </w:r>
+      <w:r>
+        <w:rPr>
+          <w:rFonts w:ascii="Times New Roman" w:hAnsi="Times New Roman" w:cs="Times New Roman"/>
+          <w:sz w:val="26"/>
+          <w:szCs w:val="26"/>
+          <w:lang w:val="vi-VN"/>
+        </w:rPr>
+        <w:t>.</w:t>
       </w:r>
     </w:p>
     <w:tbl>
@@ -2613,8 +2645,7 @@
                 <w:sz w:val="26"/>
                 <w:szCs w:val="26"/>
               </w:rPr>
-              <w:lastRenderedPageBreak/>
-              <w:t>last_silver_success_at</w:t>
+              <w:t>watermark_value</w:t>
             </w:r>
           </w:p>
         </w:tc>
@@ -2662,7 +2693,7 @@
                 <w:sz w:val="26"/>
                 <w:szCs w:val="26"/>
               </w:rPr>
-              <w:t>Timestamp of the last successful Silver load</w:t>
+              <w:t>Latest processed source watermark value</w:t>
             </w:r>
           </w:p>
         </w:tc>
@@ -2671,51 +2702,39 @@
         <w:tc>
           <w:tcPr>
             <w:tcW w:w="3116" w:type="dxa"/>
-          </w:tcPr>
-          <w:p>
-            <w:pPr>
-              <w:rPr>
-                <w:rFonts w:ascii="Times New Roman" w:hAnsi="Times New Roman" w:cs="Times New Roman"/>
-                <w:sz w:val="26"/>
-                <w:szCs w:val="26"/>
-              </w:rPr>
-            </w:pPr>
-            <w:r>
-              <w:rPr>
-                <w:rFonts w:ascii="Times New Roman" w:hAnsi="Times New Roman" w:cs="Times New Roman"/>
-                <w:sz w:val="26"/>
-                <w:szCs w:val="26"/>
-              </w:rPr>
-              <w:t>last_</w:t>
-            </w:r>
-            <w:r>
-              <w:rPr>
-                <w:rFonts w:ascii="Times New Roman" w:hAnsi="Times New Roman" w:cs="Times New Roman"/>
-                <w:sz w:val="26"/>
-                <w:szCs w:val="26"/>
-              </w:rPr>
-              <w:t>gold</w:t>
-            </w:r>
-            <w:r>
-              <w:rPr>
-                <w:rFonts w:ascii="Times New Roman" w:hAnsi="Times New Roman" w:cs="Times New Roman"/>
-                <w:sz w:val="26"/>
-                <w:szCs w:val="26"/>
-              </w:rPr>
-              <w:t>_success_at</w:t>
-            </w:r>
-          </w:p>
-        </w:tc>
-        <w:tc>
-          <w:tcPr>
-            <w:tcW w:w="3117" w:type="dxa"/>
-          </w:tcPr>
-          <w:p>
-            <w:pPr>
-              <w:rPr>
-                <w:rFonts w:ascii="Times New Roman" w:hAnsi="Times New Roman" w:cs="Times New Roman"/>
-                <w:sz w:val="26"/>
-                <w:szCs w:val="26"/>
+            <w:vAlign w:val="center"/>
+          </w:tcPr>
+          <w:p>
+            <w:pPr>
+              <w:rPr>
+                <w:rFonts w:ascii="Times New Roman" w:hAnsi="Times New Roman" w:cs="Times New Roman"/>
+                <w:sz w:val="26"/>
+                <w:szCs w:val="26"/>
+                <w:lang w:val="vi-VN"/>
+              </w:rPr>
+            </w:pPr>
+            <w:r>
+              <w:rPr>
+                <w:rFonts w:ascii="Times New Roman" w:hAnsi="Times New Roman" w:cs="Times New Roman"/>
+                <w:sz w:val="26"/>
+                <w:szCs w:val="26"/>
+              </w:rPr>
+              <w:t>created_at</w:t>
+            </w:r>
+          </w:p>
+        </w:tc>
+        <w:tc>
+          <w:tcPr>
+            <w:tcW w:w="3117" w:type="dxa"/>
+            <w:vAlign w:val="center"/>
+          </w:tcPr>
+          <w:p>
+            <w:pPr>
+              <w:rPr>
+                <w:rFonts w:ascii="Times New Roman" w:hAnsi="Times New Roman" w:cs="Times New Roman"/>
+                <w:sz w:val="26"/>
+                <w:szCs w:val="26"/>
+                <w:lang w:val="vi-VN"/>
               </w:rPr>
             </w:pPr>
             <w:r>
@@ -2731,38 +2750,24 @@
         <w:tc>
           <w:tcPr>
             <w:tcW w:w="3117" w:type="dxa"/>
-          </w:tcPr>
-          <w:p>
-            <w:pPr>
-              <w:rPr>
-                <w:rFonts w:ascii="Times New Roman" w:hAnsi="Times New Roman" w:cs="Times New Roman"/>
-                <w:sz w:val="26"/>
-                <w:szCs w:val="26"/>
-              </w:rPr>
-            </w:pPr>
-            <w:r>
-              <w:rPr>
-                <w:rFonts w:ascii="Times New Roman" w:hAnsi="Times New Roman" w:cs="Times New Roman"/>
-                <w:sz w:val="26"/>
-                <w:szCs w:val="26"/>
-              </w:rPr>
-              <w:t xml:space="preserve">Timestamp of the last successful </w:t>
-            </w:r>
-            <w:r>
-              <w:rPr>
-                <w:rFonts w:ascii="Times New Roman" w:hAnsi="Times New Roman" w:cs="Times New Roman"/>
-                <w:sz w:val="26"/>
-                <w:szCs w:val="26"/>
-              </w:rPr>
-              <w:t>gold</w:t>
-            </w:r>
-            <w:r>
-              <w:rPr>
-                <w:rFonts w:ascii="Times New Roman" w:hAnsi="Times New Roman" w:cs="Times New Roman"/>
-                <w:sz w:val="26"/>
-                <w:szCs w:val="26"/>
-              </w:rPr>
-              <w:t xml:space="preserve"> load</w:t>
+            <w:vAlign w:val="center"/>
+          </w:tcPr>
+          <w:p>
+            <w:pPr>
+              <w:rPr>
+                <w:rFonts w:ascii="Times New Roman" w:hAnsi="Times New Roman" w:cs="Times New Roman"/>
+                <w:sz w:val="26"/>
+                <w:szCs w:val="26"/>
+                <w:lang w:val="vi-VN"/>
+              </w:rPr>
+            </w:pPr>
+            <w:r>
+              <w:rPr>
+                <w:rFonts w:ascii="Times New Roman" w:hAnsi="Times New Roman" w:cs="Times New Roman"/>
+                <w:sz w:val="26"/>
+                <w:szCs w:val="26"/>
+              </w:rPr>
+              <w:t>Record creation timestamp</w:t>
             </w:r>
           </w:p>
         </w:tc>
@@ -2788,7 +2793,7 @@
                 <w:sz w:val="26"/>
                 <w:szCs w:val="26"/>
               </w:rPr>
-              <w:t>watermark_value</w:t>
+              <w:t>updated_at</w:t>
             </w:r>
           </w:p>
         </w:tc>
@@ -2836,7 +2841,169 @@
                 <w:sz w:val="26"/>
                 <w:szCs w:val="26"/>
               </w:rPr>
-              <w:t>Latest processed source watermark value</w:t>
+              <w:t>Last update timestamp</w:t>
+            </w:r>
+          </w:p>
+        </w:tc>
+      </w:tr>
+    </w:tbl>
+    <w:p>
+      <w:pPr>
+        <w:rPr>
+          <w:rFonts w:ascii="Times New Roman" w:hAnsi="Times New Roman" w:cs="Times New Roman"/>
+          <w:sz w:val="26"/>
+          <w:szCs w:val="26"/>
+          <w:lang w:val="vi-VN"/>
+        </w:rPr>
+      </w:pPr>
+    </w:p>
+    <w:p>
+      <w:pPr>
+        <w:pStyle w:val="ListParagraph"/>
+        <w:numPr>
+          <w:ilvl w:val="1"/>
+          <w:numId w:val="6"/>
+        </w:numPr>
+        <w:rPr>
+          <w:rFonts w:ascii="Times New Roman" w:hAnsi="Times New Roman" w:cs="Times New Roman"/>
+          <w:b/>
+          <w:bCs/>
+          <w:sz w:val="26"/>
+          <w:szCs w:val="26"/>
+          <w:lang w:val="vi-VN"/>
+        </w:rPr>
+      </w:pPr>
+      <w:r>
+        <w:rPr>
+          <w:rFonts w:ascii="Times New Roman" w:hAnsi="Times New Roman" w:cs="Times New Roman"/>
+          <w:b/>
+          <w:bCs/>
+          <w:sz w:val="26"/>
+          <w:szCs w:val="26"/>
+          <w:lang w:val="vi-VN"/>
+        </w:rPr>
+        <w:t>cfg.source_dim_fact</w:t>
+      </w:r>
+    </w:p>
+    <w:p>
+      <w:pPr>
+        <w:ind w:left="720"/>
+        <w:rPr>
+          <w:rFonts w:ascii="Times New Roman" w:hAnsi="Times New Roman" w:cs="Times New Roman"/>
+          <w:sz w:val="26"/>
+          <w:szCs w:val="26"/>
+          <w:lang w:val="vi-VN"/>
+        </w:rPr>
+      </w:pPr>
+      <w:r>
+        <w:rPr>
+          <w:rFonts w:ascii="Times New Roman" w:hAnsi="Times New Roman" w:cs="Times New Roman"/>
+          <w:b/>
+          <w:bCs/>
+          <w:sz w:val="26"/>
+          <w:szCs w:val="26"/>
+          <w:lang w:val="vi-VN"/>
+        </w:rPr>
+        <w:t>Purpose:</w:t>
+      </w:r>
+      <w:r>
+        <w:rPr>
+          <w:rFonts w:ascii="Times New Roman" w:hAnsi="Times New Roman" w:cs="Times New Roman"/>
+          <w:sz w:val="26"/>
+          <w:szCs w:val="26"/>
+          <w:lang w:val="vi-VN"/>
+        </w:rPr>
+        <w:t xml:space="preserve"> Defines the many-to-many relationship between source tables and Gold dimension/fact tables.</w:t>
+      </w:r>
+    </w:p>
+    <w:tbl>
+      <w:tblPr>
+        <w:tblStyle w:val="TableGrid"/>
+        <w:tblW w:w="0" w:type="auto"/>
+        <w:tblInd w:w="720" w:type="dxa"/>
+        <w:tblLook w:val="04A0" w:firstRow="1" w:lastRow="0" w:firstColumn="1" w:lastColumn="0" w:noHBand="0" w:noVBand="1"/>
+      </w:tblPr>
+      <w:tblGrid>
+        <w:gridCol w:w="2876"/>
+        <w:gridCol w:w="2877"/>
+        <w:gridCol w:w="2877"/>
+      </w:tblGrid>
+      <w:tr>
+        <w:tc>
+          <w:tcPr>
+            <w:tcW w:w="2876" w:type="dxa"/>
+            <w:vAlign w:val="center"/>
+          </w:tcPr>
+          <w:p>
+            <w:pPr>
+              <w:rPr>
+                <w:rFonts w:ascii="Times New Roman" w:hAnsi="Times New Roman" w:cs="Times New Roman"/>
+                <w:sz w:val="26"/>
+                <w:szCs w:val="26"/>
+                <w:lang w:val="vi-VN"/>
+              </w:rPr>
+            </w:pPr>
+            <w:r>
+              <w:rPr>
+                <w:rFonts w:ascii="Times New Roman" w:hAnsi="Times New Roman" w:cs="Times New Roman"/>
+                <w:b/>
+                <w:bCs/>
+                <w:sz w:val="26"/>
+                <w:szCs w:val="26"/>
+              </w:rPr>
+              <w:t>Column</w:t>
+            </w:r>
+          </w:p>
+        </w:tc>
+        <w:tc>
+          <w:tcPr>
+            <w:tcW w:w="2877" w:type="dxa"/>
+            <w:vAlign w:val="center"/>
+          </w:tcPr>
+          <w:p>
+            <w:pPr>
+              <w:rPr>
+                <w:rFonts w:ascii="Times New Roman" w:hAnsi="Times New Roman" w:cs="Times New Roman"/>
+                <w:sz w:val="26"/>
+                <w:szCs w:val="26"/>
+                <w:lang w:val="vi-VN"/>
+              </w:rPr>
+            </w:pPr>
+            <w:r>
+              <w:rPr>
+                <w:rFonts w:ascii="Times New Roman" w:hAnsi="Times New Roman" w:cs="Times New Roman"/>
+                <w:b/>
+                <w:bCs/>
+                <w:sz w:val="26"/>
+                <w:szCs w:val="26"/>
+              </w:rPr>
+              <w:t>Data Type</w:t>
+            </w:r>
+          </w:p>
+        </w:tc>
+        <w:tc>
+          <w:tcPr>
+            <w:tcW w:w="2877" w:type="dxa"/>
+            <w:vAlign w:val="center"/>
+          </w:tcPr>
+          <w:p>
+            <w:pPr>
+              <w:rPr>
+                <w:rFonts w:ascii="Times New Roman" w:hAnsi="Times New Roman" w:cs="Times New Roman"/>
+                <w:sz w:val="26"/>
+                <w:szCs w:val="26"/>
+                <w:lang w:val="vi-VN"/>
+              </w:rPr>
+            </w:pPr>
+            <w:r>
+              <w:rPr>
+                <w:rFonts w:ascii="Times New Roman" w:hAnsi="Times New Roman" w:cs="Times New Roman"/>
+                <w:b/>
+                <w:bCs/>
+                <w:sz w:val="26"/>
+                <w:szCs w:val="26"/>
+              </w:rPr>
+              <w:t>Description</w:t>
             </w:r>
           </w:p>
         </w:tc>
@@ -2844,73 +3011,73 @@
       <w:tr>
         <w:tc>
           <w:tcPr>
-            <w:tcW w:w="3116" w:type="dxa"/>
-            <w:vAlign w:val="center"/>
-          </w:tcPr>
-          <w:p>
-            <w:pPr>
-              <w:rPr>
-                <w:rFonts w:ascii="Times New Roman" w:hAnsi="Times New Roman" w:cs="Times New Roman"/>
-                <w:sz w:val="26"/>
-                <w:szCs w:val="26"/>
-                <w:lang w:val="vi-VN"/>
-              </w:rPr>
-            </w:pPr>
-            <w:r>
-              <w:rPr>
-                <w:rFonts w:ascii="Times New Roman" w:hAnsi="Times New Roman" w:cs="Times New Roman"/>
-                <w:sz w:val="26"/>
-                <w:szCs w:val="26"/>
-              </w:rPr>
-              <w:t>created_at</w:t>
-            </w:r>
-          </w:p>
-        </w:tc>
-        <w:tc>
-          <w:tcPr>
-            <w:tcW w:w="3117" w:type="dxa"/>
-            <w:vAlign w:val="center"/>
-          </w:tcPr>
-          <w:p>
-            <w:pPr>
-              <w:rPr>
-                <w:rFonts w:ascii="Times New Roman" w:hAnsi="Times New Roman" w:cs="Times New Roman"/>
-                <w:sz w:val="26"/>
-                <w:szCs w:val="26"/>
-                <w:lang w:val="vi-VN"/>
-              </w:rPr>
-            </w:pPr>
-            <w:r>
-              <w:rPr>
-                <w:rFonts w:ascii="Times New Roman" w:hAnsi="Times New Roman" w:cs="Times New Roman"/>
-                <w:sz w:val="26"/>
-                <w:szCs w:val="26"/>
-              </w:rPr>
-              <w:t>timestamp</w:t>
-            </w:r>
-          </w:p>
-        </w:tc>
-        <w:tc>
-          <w:tcPr>
-            <w:tcW w:w="3117" w:type="dxa"/>
-            <w:vAlign w:val="center"/>
-          </w:tcPr>
-          <w:p>
-            <w:pPr>
-              <w:rPr>
-                <w:rFonts w:ascii="Times New Roman" w:hAnsi="Times New Roman" w:cs="Times New Roman"/>
-                <w:sz w:val="26"/>
-                <w:szCs w:val="26"/>
-                <w:lang w:val="vi-VN"/>
-              </w:rPr>
-            </w:pPr>
-            <w:r>
-              <w:rPr>
-                <w:rFonts w:ascii="Times New Roman" w:hAnsi="Times New Roman" w:cs="Times New Roman"/>
-                <w:sz w:val="26"/>
-                <w:szCs w:val="26"/>
-              </w:rPr>
-              <w:t>Record creation timestamp</w:t>
+            <w:tcW w:w="2876" w:type="dxa"/>
+            <w:vAlign w:val="center"/>
+          </w:tcPr>
+          <w:p>
+            <w:pPr>
+              <w:rPr>
+                <w:rFonts w:ascii="Times New Roman" w:hAnsi="Times New Roman" w:cs="Times New Roman"/>
+                <w:sz w:val="26"/>
+                <w:szCs w:val="26"/>
+                <w:lang w:val="vi-VN"/>
+              </w:rPr>
+            </w:pPr>
+            <w:r>
+              <w:rPr>
+                <w:rFonts w:ascii="Times New Roman" w:hAnsi="Times New Roman" w:cs="Times New Roman"/>
+                <w:sz w:val="26"/>
+                <w:szCs w:val="26"/>
+              </w:rPr>
+              <w:t>dim_fact_table_id</w:t>
+            </w:r>
+          </w:p>
+        </w:tc>
+        <w:tc>
+          <w:tcPr>
+            <w:tcW w:w="2877" w:type="dxa"/>
+            <w:vAlign w:val="center"/>
+          </w:tcPr>
+          <w:p>
+            <w:pPr>
+              <w:rPr>
+                <w:rFonts w:ascii="Times New Roman" w:hAnsi="Times New Roman" w:cs="Times New Roman"/>
+                <w:sz w:val="26"/>
+                <w:szCs w:val="26"/>
+                <w:lang w:val="vi-VN"/>
+              </w:rPr>
+            </w:pPr>
+            <w:r>
+              <w:rPr>
+                <w:rFonts w:ascii="Times New Roman" w:hAnsi="Times New Roman" w:cs="Times New Roman"/>
+                <w:sz w:val="26"/>
+                <w:szCs w:val="26"/>
+              </w:rPr>
+              <w:t>bigint</w:t>
+            </w:r>
+          </w:p>
+        </w:tc>
+        <w:tc>
+          <w:tcPr>
+            <w:tcW w:w="2877" w:type="dxa"/>
+            <w:vAlign w:val="center"/>
+          </w:tcPr>
+          <w:p>
+            <w:pPr>
+              <w:rPr>
+                <w:rFonts w:ascii="Times New Roman" w:hAnsi="Times New Roman" w:cs="Times New Roman"/>
+                <w:sz w:val="26"/>
+                <w:szCs w:val="26"/>
+                <w:lang w:val="vi-VN"/>
+              </w:rPr>
+            </w:pPr>
+            <w:r>
+              <w:rPr>
+                <w:rFonts w:ascii="Times New Roman" w:hAnsi="Times New Roman" w:cs="Times New Roman"/>
+                <w:sz w:val="26"/>
+                <w:szCs w:val="26"/>
+              </w:rPr>
+              <w:t>Gold dimension/fact table configuration identifier</w:t>
             </w:r>
           </w:p>
         </w:tc>
@@ -2918,7 +3085,155 @@
       <w:tr>
         <w:tc>
           <w:tcPr>
-            <w:tcW w:w="3116" w:type="dxa"/>
+            <w:tcW w:w="2876" w:type="dxa"/>
+            <w:vAlign w:val="center"/>
+          </w:tcPr>
+          <w:p>
+            <w:pPr>
+              <w:rPr>
+                <w:rFonts w:ascii="Times New Roman" w:hAnsi="Times New Roman" w:cs="Times New Roman"/>
+                <w:sz w:val="26"/>
+                <w:szCs w:val="26"/>
+                <w:lang w:val="vi-VN"/>
+              </w:rPr>
+            </w:pPr>
+            <w:r>
+              <w:rPr>
+                <w:rFonts w:ascii="Times New Roman" w:hAnsi="Times New Roman" w:cs="Times New Roman"/>
+                <w:sz w:val="26"/>
+                <w:szCs w:val="26"/>
+              </w:rPr>
+              <w:t>source_table_id</w:t>
+            </w:r>
+          </w:p>
+        </w:tc>
+        <w:tc>
+          <w:tcPr>
+            <w:tcW w:w="2877" w:type="dxa"/>
+            <w:vAlign w:val="center"/>
+          </w:tcPr>
+          <w:p>
+            <w:pPr>
+              <w:rPr>
+                <w:rFonts w:ascii="Times New Roman" w:hAnsi="Times New Roman" w:cs="Times New Roman"/>
+                <w:sz w:val="26"/>
+                <w:szCs w:val="26"/>
+                <w:lang w:val="vi-VN"/>
+              </w:rPr>
+            </w:pPr>
+            <w:r>
+              <w:rPr>
+                <w:rFonts w:ascii="Times New Roman" w:hAnsi="Times New Roman" w:cs="Times New Roman"/>
+                <w:sz w:val="26"/>
+                <w:szCs w:val="26"/>
+              </w:rPr>
+              <w:t>bigint</w:t>
+            </w:r>
+          </w:p>
+        </w:tc>
+        <w:tc>
+          <w:tcPr>
+            <w:tcW w:w="2877" w:type="dxa"/>
+            <w:vAlign w:val="center"/>
+          </w:tcPr>
+          <w:p>
+            <w:pPr>
+              <w:rPr>
+                <w:rFonts w:ascii="Times New Roman" w:hAnsi="Times New Roman" w:cs="Times New Roman"/>
+                <w:sz w:val="26"/>
+                <w:szCs w:val="26"/>
+                <w:lang w:val="vi-VN"/>
+              </w:rPr>
+            </w:pPr>
+            <w:r>
+              <w:rPr>
+                <w:rFonts w:ascii="Times New Roman" w:hAnsi="Times New Roman" w:cs="Times New Roman"/>
+                <w:sz w:val="26"/>
+                <w:szCs w:val="26"/>
+              </w:rPr>
+              <w:t>Source table configuration identifier</w:t>
+            </w:r>
+          </w:p>
+        </w:tc>
+      </w:tr>
+      <w:tr>
+        <w:tc>
+          <w:tcPr>
+            <w:tcW w:w="2876" w:type="dxa"/>
+            <w:vAlign w:val="center"/>
+          </w:tcPr>
+          <w:p>
+            <w:pPr>
+              <w:rPr>
+                <w:rFonts w:ascii="Times New Roman" w:hAnsi="Times New Roman" w:cs="Times New Roman"/>
+                <w:sz w:val="26"/>
+                <w:szCs w:val="26"/>
+                <w:lang w:val="vi-VN"/>
+              </w:rPr>
+            </w:pPr>
+            <w:r>
+              <w:rPr>
+                <w:rFonts w:ascii="Times New Roman" w:hAnsi="Times New Roman" w:cs="Times New Roman"/>
+                <w:sz w:val="26"/>
+                <w:szCs w:val="26"/>
+              </w:rPr>
+              <w:t>created_at</w:t>
+            </w:r>
+          </w:p>
+        </w:tc>
+        <w:tc>
+          <w:tcPr>
+            <w:tcW w:w="2877" w:type="dxa"/>
+            <w:vAlign w:val="center"/>
+          </w:tcPr>
+          <w:p>
+            <w:pPr>
+              <w:rPr>
+                <w:rFonts w:ascii="Times New Roman" w:hAnsi="Times New Roman" w:cs="Times New Roman"/>
+                <w:sz w:val="26"/>
+                <w:szCs w:val="26"/>
+                <w:lang w:val="vi-VN"/>
+              </w:rPr>
+            </w:pPr>
+            <w:r>
+              <w:rPr>
+                <w:rFonts w:ascii="Times New Roman" w:hAnsi="Times New Roman" w:cs="Times New Roman"/>
+                <w:sz w:val="26"/>
+                <w:szCs w:val="26"/>
+              </w:rPr>
+              <w:t>timestamp</w:t>
+            </w:r>
+          </w:p>
+        </w:tc>
+        <w:tc>
+          <w:tcPr>
+            <w:tcW w:w="2877" w:type="dxa"/>
+            <w:vAlign w:val="center"/>
+          </w:tcPr>
+          <w:p>
+            <w:pPr>
+              <w:rPr>
+                <w:rFonts w:ascii="Times New Roman" w:hAnsi="Times New Roman" w:cs="Times New Roman"/>
+                <w:sz w:val="26"/>
+                <w:szCs w:val="26"/>
+                <w:lang w:val="vi-VN"/>
+              </w:rPr>
+            </w:pPr>
+            <w:r>
+              <w:rPr>
+                <w:rFonts w:ascii="Times New Roman" w:hAnsi="Times New Roman" w:cs="Times New Roman"/>
+                <w:sz w:val="26"/>
+                <w:szCs w:val="26"/>
+              </w:rPr>
+              <w:t>Record creation timestamp</w:t>
+            </w:r>
+          </w:p>
+        </w:tc>
+      </w:tr>
+      <w:tr>
+        <w:tc>
+          <w:tcPr>
+            <w:tcW w:w="2876" w:type="dxa"/>
             <w:vAlign w:val="center"/>
           </w:tcPr>
           <w:p>
@@ -2942,7 +3257,7 @@
         </w:tc>
         <w:tc>
           <w:tcPr>
-            <w:tcW w:w="3117" w:type="dxa"/>
+            <w:tcW w:w="2877" w:type="dxa"/>
             <w:vAlign w:val="center"/>
           </w:tcPr>
           <w:p>
@@ -2966,7 +3281,7 @@
         </w:tc>
         <w:tc>
           <w:tcPr>
-            <w:tcW w:w="3117" w:type="dxa"/>
+            <w:tcW w:w="2877" w:type="dxa"/>
             <w:vAlign w:val="center"/>
           </w:tcPr>
           <w:p>
@@ -2990,6 +3305,91 @@
         </w:tc>
       </w:tr>
     </w:tbl>
+    <w:p>
+      <w:pPr>
+        <w:ind w:left="720"/>
+        <w:rPr>
+          <w:rFonts w:ascii="Times New Roman" w:hAnsi="Times New Roman" w:cs="Times New Roman"/>
+          <w:sz w:val="26"/>
+          <w:szCs w:val="26"/>
+          <w:lang w:val="vi-VN"/>
+        </w:rPr>
+      </w:pPr>
+    </w:p>
+    <w:p>
+      <w:pPr>
+        <w:ind w:left="720"/>
+        <w:rPr>
+          <w:rFonts w:ascii="Times New Roman" w:hAnsi="Times New Roman" w:cs="Times New Roman"/>
+          <w:sz w:val="26"/>
+          <w:szCs w:val="26"/>
+          <w:lang w:val="vi-VN"/>
+        </w:rPr>
+      </w:pPr>
+    </w:p>
+    <w:p>
+      <w:pPr>
+        <w:ind w:left="720"/>
+        <w:rPr>
+          <w:rFonts w:ascii="Times New Roman" w:hAnsi="Times New Roman" w:cs="Times New Roman"/>
+          <w:sz w:val="26"/>
+          <w:szCs w:val="26"/>
+          <w:lang w:val="vi-VN"/>
+        </w:rPr>
+      </w:pPr>
+    </w:p>
+    <w:p>
+      <w:pPr>
+        <w:ind w:left="720"/>
+        <w:rPr>
+          <w:rFonts w:ascii="Times New Roman" w:hAnsi="Times New Roman" w:cs="Times New Roman"/>
+          <w:sz w:val="26"/>
+          <w:szCs w:val="26"/>
+          <w:lang w:val="vi-VN"/>
+        </w:rPr>
+      </w:pPr>
+    </w:p>
+    <w:p>
+      <w:pPr>
+        <w:ind w:left="720"/>
+        <w:rPr>
+          <w:rFonts w:ascii="Times New Roman" w:hAnsi="Times New Roman" w:cs="Times New Roman"/>
+          <w:sz w:val="26"/>
+          <w:szCs w:val="26"/>
+          <w:lang w:val="vi-VN"/>
+        </w:rPr>
+      </w:pPr>
+    </w:p>
+    <w:p>
+      <w:pPr>
+        <w:rPr>
+          <w:rFonts w:ascii="Times New Roman" w:hAnsi="Times New Roman" w:cs="Times New Roman"/>
+          <w:sz w:val="26"/>
+          <w:szCs w:val="26"/>
+          <w:lang w:val="vi-VN"/>
+        </w:rPr>
+      </w:pPr>
+    </w:p>
+    <w:p>
+      <w:pPr>
+        <w:rPr>
+          <w:rFonts w:ascii="Times New Roman" w:hAnsi="Times New Roman" w:cs="Times New Roman"/>
+          <w:sz w:val="26"/>
+          <w:szCs w:val="26"/>
+          <w:lang w:val="vi-VN"/>
+        </w:rPr>
+      </w:pPr>
+    </w:p>
+    <w:p>
+      <w:pPr>
+        <w:rPr>
+          <w:rFonts w:ascii="Times New Roman" w:hAnsi="Times New Roman" w:cs="Times New Roman"/>
+          <w:sz w:val="26"/>
+          <w:szCs w:val="26"/>
+          <w:lang w:val="vi-VN"/>
+        </w:rPr>
+      </w:pPr>
+    </w:p>
     <w:p>
       <w:pPr>
         <w:rPr>
@@ -3162,17 +3562,6 @@
         <w:t>.</w:t>
       </w:r>
     </w:p>
-    <w:p>
-      <w:pPr>
-        <w:ind w:firstLine="720"/>
-        <w:rPr>
-          <w:rFonts w:ascii="Times New Roman" w:hAnsi="Times New Roman" w:cs="Times New Roman"/>
-          <w:sz w:val="26"/>
-          <w:szCs w:val="26"/>
-          <w:lang w:val="vi-VN"/>
-        </w:rPr>
-      </w:pPr>
-    </w:p>
     <w:tbl>
       <w:tblPr>
         <w:tblStyle w:val="TableGrid"/>
@@ -3433,7 +3822,6 @@
                 <w:sz w:val="26"/>
                 <w:szCs w:val="26"/>
               </w:rPr>
-              <w:lastRenderedPageBreak/>
               <w:t>run_mode</w:t>
             </w:r>
           </w:p>
@@ -3886,72 +4274,79 @@
         <w:tc>
           <w:tcPr>
             <w:tcW w:w="3116" w:type="dxa"/>
-            <w:vAlign w:val="center"/>
-          </w:tcPr>
-          <w:p>
-            <w:pPr>
-              <w:rPr>
-                <w:rFonts w:ascii="Times New Roman" w:hAnsi="Times New Roman" w:cs="Times New Roman"/>
-                <w:sz w:val="26"/>
-                <w:szCs w:val="26"/>
-                <w:lang w:val="vi-VN"/>
-              </w:rPr>
-            </w:pPr>
-            <w:r>
-              <w:rPr>
-                <w:rFonts w:ascii="Times New Roman" w:hAnsi="Times New Roman" w:cs="Times New Roman"/>
-                <w:sz w:val="26"/>
-                <w:szCs w:val="26"/>
-              </w:rPr>
-              <w:t>created_at</w:t>
-            </w:r>
-          </w:p>
-        </w:tc>
-        <w:tc>
-          <w:tcPr>
-            <w:tcW w:w="3117" w:type="dxa"/>
-            <w:vAlign w:val="center"/>
-          </w:tcPr>
-          <w:p>
-            <w:pPr>
-              <w:rPr>
-                <w:rFonts w:ascii="Times New Roman" w:hAnsi="Times New Roman" w:cs="Times New Roman"/>
-                <w:sz w:val="26"/>
-                <w:szCs w:val="26"/>
-                <w:lang w:val="vi-VN"/>
-              </w:rPr>
-            </w:pPr>
-            <w:r>
-              <w:rPr>
-                <w:rFonts w:ascii="Times New Roman" w:hAnsi="Times New Roman" w:cs="Times New Roman"/>
-                <w:sz w:val="26"/>
-                <w:szCs w:val="26"/>
-              </w:rPr>
-              <w:t>timestamp</w:t>
-            </w:r>
-          </w:p>
-        </w:tc>
-        <w:tc>
-          <w:tcPr>
-            <w:tcW w:w="3117" w:type="dxa"/>
-            <w:vAlign w:val="center"/>
-          </w:tcPr>
-          <w:p>
-            <w:pPr>
-              <w:rPr>
-                <w:rFonts w:ascii="Times New Roman" w:hAnsi="Times New Roman" w:cs="Times New Roman"/>
-                <w:sz w:val="26"/>
-                <w:szCs w:val="26"/>
-                <w:lang w:val="vi-VN"/>
-              </w:rPr>
-            </w:pPr>
-            <w:r>
-              <w:rPr>
-                <w:rFonts w:ascii="Times New Roman" w:hAnsi="Times New Roman" w:cs="Times New Roman"/>
-                <w:sz w:val="26"/>
-                <w:szCs w:val="26"/>
-              </w:rPr>
-              <w:t>Record creation timestamp</w:t>
+          </w:tcPr>
+          <w:p>
+            <w:pPr>
+              <w:rPr>
+                <w:rFonts w:ascii="Times New Roman" w:hAnsi="Times New Roman" w:cs="Times New Roman"/>
+                <w:b/>
+                <w:bCs/>
+                <w:sz w:val="26"/>
+                <w:szCs w:val="26"/>
+              </w:rPr>
+            </w:pPr>
+            <w:r>
+              <w:rPr>
+                <w:rFonts w:ascii="Times New Roman" w:hAnsi="Times New Roman" w:cs="Times New Roman"/>
+                <w:b/>
+                <w:bCs/>
+                <w:sz w:val="26"/>
+                <w:szCs w:val="26"/>
+              </w:rPr>
+              <w:lastRenderedPageBreak/>
+              <w:t>Column</w:t>
+            </w:r>
+          </w:p>
+        </w:tc>
+        <w:tc>
+          <w:tcPr>
+            <w:tcW w:w="3117" w:type="dxa"/>
+          </w:tcPr>
+          <w:p>
+            <w:pPr>
+              <w:rPr>
+                <w:rFonts w:ascii="Times New Roman" w:hAnsi="Times New Roman" w:cs="Times New Roman"/>
+                <w:b/>
+                <w:bCs/>
+                <w:sz w:val="26"/>
+                <w:szCs w:val="26"/>
+              </w:rPr>
+            </w:pPr>
+            <w:r>
+              <w:rPr>
+                <w:rFonts w:ascii="Times New Roman" w:hAnsi="Times New Roman" w:cs="Times New Roman"/>
+                <w:b/>
+                <w:bCs/>
+                <w:sz w:val="26"/>
+                <w:szCs w:val="26"/>
+              </w:rPr>
+              <w:t>Data Type</w:t>
+            </w:r>
+          </w:p>
+        </w:tc>
+        <w:tc>
+          <w:tcPr>
+            <w:tcW w:w="3117" w:type="dxa"/>
+          </w:tcPr>
+          <w:p>
+            <w:pPr>
+              <w:rPr>
+                <w:rFonts w:ascii="Times New Roman" w:hAnsi="Times New Roman" w:cs="Times New Roman"/>
+                <w:b/>
+                <w:bCs/>
+                <w:sz w:val="26"/>
+                <w:szCs w:val="26"/>
+              </w:rPr>
+            </w:pPr>
+            <w:r>
+              <w:rPr>
+                <w:rFonts w:ascii="Times New Roman" w:hAnsi="Times New Roman" w:cs="Times New Roman"/>
+                <w:b/>
+                <w:bCs/>
+                <w:sz w:val="26"/>
+                <w:szCs w:val="26"/>
+              </w:rPr>
+              <w:t>Description</w:t>
             </w:r>
           </w:p>
         </w:tc>
@@ -3977,6 +4372,80 @@
                 <w:sz w:val="26"/>
                 <w:szCs w:val="26"/>
               </w:rPr>
+              <w:t>created_at</w:t>
+            </w:r>
+          </w:p>
+        </w:tc>
+        <w:tc>
+          <w:tcPr>
+            <w:tcW w:w="3117" w:type="dxa"/>
+            <w:vAlign w:val="center"/>
+          </w:tcPr>
+          <w:p>
+            <w:pPr>
+              <w:rPr>
+                <w:rFonts w:ascii="Times New Roman" w:hAnsi="Times New Roman" w:cs="Times New Roman"/>
+                <w:sz w:val="26"/>
+                <w:szCs w:val="26"/>
+                <w:lang w:val="vi-VN"/>
+              </w:rPr>
+            </w:pPr>
+            <w:r>
+              <w:rPr>
+                <w:rFonts w:ascii="Times New Roman" w:hAnsi="Times New Roman" w:cs="Times New Roman"/>
+                <w:sz w:val="26"/>
+                <w:szCs w:val="26"/>
+              </w:rPr>
+              <w:t>timestamp</w:t>
+            </w:r>
+          </w:p>
+        </w:tc>
+        <w:tc>
+          <w:tcPr>
+            <w:tcW w:w="3117" w:type="dxa"/>
+            <w:vAlign w:val="center"/>
+          </w:tcPr>
+          <w:p>
+            <w:pPr>
+              <w:rPr>
+                <w:rFonts w:ascii="Times New Roman" w:hAnsi="Times New Roman" w:cs="Times New Roman"/>
+                <w:sz w:val="26"/>
+                <w:szCs w:val="26"/>
+                <w:lang w:val="vi-VN"/>
+              </w:rPr>
+            </w:pPr>
+            <w:r>
+              <w:rPr>
+                <w:rFonts w:ascii="Times New Roman" w:hAnsi="Times New Roman" w:cs="Times New Roman"/>
+                <w:sz w:val="26"/>
+                <w:szCs w:val="26"/>
+              </w:rPr>
+              <w:t>Record creation timestamp</w:t>
+            </w:r>
+          </w:p>
+        </w:tc>
+      </w:tr>
+      <w:tr>
+        <w:tc>
+          <w:tcPr>
+            <w:tcW w:w="3116" w:type="dxa"/>
+            <w:vAlign w:val="center"/>
+          </w:tcPr>
+          <w:p>
+            <w:pPr>
+              <w:rPr>
+                <w:rFonts w:ascii="Times New Roman" w:hAnsi="Times New Roman" w:cs="Times New Roman"/>
+                <w:sz w:val="26"/>
+                <w:szCs w:val="26"/>
+                <w:lang w:val="vi-VN"/>
+              </w:rPr>
+            </w:pPr>
+            <w:r>
+              <w:rPr>
+                <w:rFonts w:ascii="Times New Roman" w:hAnsi="Times New Roman" w:cs="Times New Roman"/>
+                <w:sz w:val="26"/>
+                <w:szCs w:val="26"/>
+              </w:rPr>
               <w:t>updated_at</w:t>
             </w:r>
           </w:p>
@@ -4031,16 +4500,6 @@
         </w:tc>
       </w:tr>
     </w:tbl>
-    <w:p>
-      <w:pPr>
-        <w:rPr>
-          <w:rFonts w:ascii="Times New Roman" w:hAnsi="Times New Roman" w:cs="Times New Roman"/>
-          <w:sz w:val="26"/>
-          <w:szCs w:val="26"/>
-          <w:lang w:val="vi-VN"/>
-        </w:rPr>
-      </w:pPr>
-    </w:p>
     <w:p>
       <w:pPr>
         <w:pStyle w:val="ListParagraph"/>
@@ -4097,16 +4556,7 @@
           <w:szCs w:val="26"/>
           <w:lang w:val="vi-VN"/>
         </w:rPr>
-        <w:t xml:space="preserve"> Stores table-level execution status across Bronze, Silver, and Gold </w:t>
-      </w:r>
-      <w:r>
-        <w:rPr>
-          <w:rFonts w:ascii="Times New Roman" w:hAnsi="Times New Roman" w:cs="Times New Roman"/>
-          <w:sz w:val="26"/>
-          <w:szCs w:val="26"/>
-          <w:lang w:val="vi-VN"/>
-        </w:rPr>
-        <w:t>layers.</w:t>
+        <w:t xml:space="preserve"> Stores table-level execution status across Bronze, Silver, and Gold layers.</w:t>
       </w:r>
     </w:p>
     <w:tbl>
@@ -5035,79 +5485,72 @@
         <w:tc>
           <w:tcPr>
             <w:tcW w:w="3116" w:type="dxa"/>
-          </w:tcPr>
-          <w:p>
-            <w:pPr>
-              <w:rPr>
-                <w:rFonts w:ascii="Times New Roman" w:hAnsi="Times New Roman" w:cs="Times New Roman"/>
-                <w:b/>
-                <w:bCs/>
-                <w:sz w:val="26"/>
-                <w:szCs w:val="26"/>
-              </w:rPr>
-            </w:pPr>
-            <w:r>
-              <w:rPr>
-                <w:rFonts w:ascii="Times New Roman" w:hAnsi="Times New Roman" w:cs="Times New Roman"/>
-                <w:b/>
-                <w:bCs/>
-                <w:sz w:val="26"/>
-                <w:szCs w:val="26"/>
-              </w:rPr>
-              <w:lastRenderedPageBreak/>
-              <w:t>Column</w:t>
-            </w:r>
-          </w:p>
-        </w:tc>
-        <w:tc>
-          <w:tcPr>
-            <w:tcW w:w="3117" w:type="dxa"/>
-          </w:tcPr>
-          <w:p>
-            <w:pPr>
-              <w:rPr>
-                <w:rFonts w:ascii="Times New Roman" w:hAnsi="Times New Roman" w:cs="Times New Roman"/>
-                <w:b/>
-                <w:bCs/>
-                <w:sz w:val="26"/>
-                <w:szCs w:val="26"/>
-              </w:rPr>
-            </w:pPr>
-            <w:r>
-              <w:rPr>
-                <w:rFonts w:ascii="Times New Roman" w:hAnsi="Times New Roman" w:cs="Times New Roman"/>
-                <w:b/>
-                <w:bCs/>
-                <w:sz w:val="26"/>
-                <w:szCs w:val="26"/>
-              </w:rPr>
-              <w:t>Data Type</w:t>
-            </w:r>
-          </w:p>
-        </w:tc>
-        <w:tc>
-          <w:tcPr>
-            <w:tcW w:w="3117" w:type="dxa"/>
-          </w:tcPr>
-          <w:p>
-            <w:pPr>
-              <w:rPr>
-                <w:rFonts w:ascii="Times New Roman" w:hAnsi="Times New Roman" w:cs="Times New Roman"/>
-                <w:b/>
-                <w:bCs/>
-                <w:sz w:val="26"/>
-                <w:szCs w:val="26"/>
-              </w:rPr>
-            </w:pPr>
-            <w:r>
-              <w:rPr>
-                <w:rFonts w:ascii="Times New Roman" w:hAnsi="Times New Roman" w:cs="Times New Roman"/>
-                <w:b/>
-                <w:bCs/>
-                <w:sz w:val="26"/>
-                <w:szCs w:val="26"/>
-              </w:rPr>
-              <w:t>Description</w:t>
+            <w:vAlign w:val="center"/>
+          </w:tcPr>
+          <w:p>
+            <w:pPr>
+              <w:rPr>
+                <w:rFonts w:ascii="Times New Roman" w:hAnsi="Times New Roman" w:cs="Times New Roman"/>
+                <w:sz w:val="26"/>
+                <w:szCs w:val="26"/>
+                <w:lang w:val="vi-VN"/>
+              </w:rPr>
+            </w:pPr>
+            <w:r>
+              <w:rPr>
+                <w:rFonts w:ascii="Times New Roman" w:hAnsi="Times New Roman" w:cs="Times New Roman"/>
+                <w:sz w:val="26"/>
+                <w:szCs w:val="26"/>
+              </w:rPr>
+              <w:t>bronze_ended_at</w:t>
+            </w:r>
+          </w:p>
+        </w:tc>
+        <w:tc>
+          <w:tcPr>
+            <w:tcW w:w="3117" w:type="dxa"/>
+            <w:vAlign w:val="center"/>
+          </w:tcPr>
+          <w:p>
+            <w:pPr>
+              <w:rPr>
+                <w:rFonts w:ascii="Times New Roman" w:hAnsi="Times New Roman" w:cs="Times New Roman"/>
+                <w:sz w:val="26"/>
+                <w:szCs w:val="26"/>
+                <w:lang w:val="vi-VN"/>
+              </w:rPr>
+            </w:pPr>
+            <w:r>
+              <w:rPr>
+                <w:rFonts w:ascii="Times New Roman" w:hAnsi="Times New Roman" w:cs="Times New Roman"/>
+                <w:sz w:val="26"/>
+                <w:szCs w:val="26"/>
+              </w:rPr>
+              <w:t>timestamp</w:t>
+            </w:r>
+          </w:p>
+        </w:tc>
+        <w:tc>
+          <w:tcPr>
+            <w:tcW w:w="3117" w:type="dxa"/>
+            <w:vAlign w:val="center"/>
+          </w:tcPr>
+          <w:p>
+            <w:pPr>
+              <w:rPr>
+                <w:rFonts w:ascii="Times New Roman" w:hAnsi="Times New Roman" w:cs="Times New Roman"/>
+                <w:sz w:val="26"/>
+                <w:szCs w:val="26"/>
+                <w:lang w:val="vi-VN"/>
+              </w:rPr>
+            </w:pPr>
+            <w:r>
+              <w:rPr>
+                <w:rFonts w:ascii="Times New Roman" w:hAnsi="Times New Roman" w:cs="Times New Roman"/>
+                <w:sz w:val="26"/>
+                <w:szCs w:val="26"/>
+              </w:rPr>
+              <w:t>Bronze processing completion timestamp</w:t>
             </w:r>
           </w:p>
         </w:tc>
@@ -5133,7 +5576,7 @@
                 <w:sz w:val="26"/>
                 <w:szCs w:val="26"/>
               </w:rPr>
-              <w:t>bronze_ended_at</w:t>
+              <w:t>silver_ended_at</w:t>
             </w:r>
           </w:p>
         </w:tc>
@@ -5181,7 +5624,7 @@
                 <w:sz w:val="26"/>
                 <w:szCs w:val="26"/>
               </w:rPr>
-              <w:t>Bronze processing completion timestamp</w:t>
+              <w:t>Silver processing completion timestamp</w:t>
             </w:r>
           </w:p>
         </w:tc>
@@ -5207,7 +5650,7 @@
                 <w:sz w:val="26"/>
                 <w:szCs w:val="26"/>
               </w:rPr>
-              <w:t>silver_ended_at</w:t>
+              <w:t>gold_ended_at</w:t>
             </w:r>
           </w:p>
         </w:tc>
@@ -5255,7 +5698,7 @@
                 <w:sz w:val="26"/>
                 <w:szCs w:val="26"/>
               </w:rPr>
-              <w:t>Silver processing completion timestamp</w:t>
+              <w:t>Gold processing completion timestamp</w:t>
             </w:r>
           </w:p>
         </w:tc>
@@ -5281,55 +5724,55 @@
                 <w:sz w:val="26"/>
                 <w:szCs w:val="26"/>
               </w:rPr>
-              <w:t>gold_ended_at</w:t>
-            </w:r>
-          </w:p>
-        </w:tc>
-        <w:tc>
-          <w:tcPr>
-            <w:tcW w:w="3117" w:type="dxa"/>
-            <w:vAlign w:val="center"/>
-          </w:tcPr>
-          <w:p>
-            <w:pPr>
-              <w:rPr>
-                <w:rFonts w:ascii="Times New Roman" w:hAnsi="Times New Roman" w:cs="Times New Roman"/>
-                <w:sz w:val="26"/>
-                <w:szCs w:val="26"/>
-                <w:lang w:val="vi-VN"/>
-              </w:rPr>
-            </w:pPr>
-            <w:r>
-              <w:rPr>
-                <w:rFonts w:ascii="Times New Roman" w:hAnsi="Times New Roman" w:cs="Times New Roman"/>
-                <w:sz w:val="26"/>
-                <w:szCs w:val="26"/>
-              </w:rPr>
-              <w:t>timestamp</w:t>
-            </w:r>
-          </w:p>
-        </w:tc>
-        <w:tc>
-          <w:tcPr>
-            <w:tcW w:w="3117" w:type="dxa"/>
-            <w:vAlign w:val="center"/>
-          </w:tcPr>
-          <w:p>
-            <w:pPr>
-              <w:rPr>
-                <w:rFonts w:ascii="Times New Roman" w:hAnsi="Times New Roman" w:cs="Times New Roman"/>
-                <w:sz w:val="26"/>
-                <w:szCs w:val="26"/>
-                <w:lang w:val="vi-VN"/>
-              </w:rPr>
-            </w:pPr>
-            <w:r>
-              <w:rPr>
-                <w:rFonts w:ascii="Times New Roman" w:hAnsi="Times New Roman" w:cs="Times New Roman"/>
-                <w:sz w:val="26"/>
-                <w:szCs w:val="26"/>
-              </w:rPr>
-              <w:t>Gold processing completion timestamp</w:t>
+              <w:t>retry_count</w:t>
+            </w:r>
+          </w:p>
+        </w:tc>
+        <w:tc>
+          <w:tcPr>
+            <w:tcW w:w="3117" w:type="dxa"/>
+            <w:vAlign w:val="center"/>
+          </w:tcPr>
+          <w:p>
+            <w:pPr>
+              <w:rPr>
+                <w:rFonts w:ascii="Times New Roman" w:hAnsi="Times New Roman" w:cs="Times New Roman"/>
+                <w:sz w:val="26"/>
+                <w:szCs w:val="26"/>
+                <w:lang w:val="vi-VN"/>
+              </w:rPr>
+            </w:pPr>
+            <w:r>
+              <w:rPr>
+                <w:rFonts w:ascii="Times New Roman" w:hAnsi="Times New Roman" w:cs="Times New Roman"/>
+                <w:sz w:val="26"/>
+                <w:szCs w:val="26"/>
+              </w:rPr>
+              <w:t>int</w:t>
+            </w:r>
+          </w:p>
+        </w:tc>
+        <w:tc>
+          <w:tcPr>
+            <w:tcW w:w="3117" w:type="dxa"/>
+            <w:vAlign w:val="center"/>
+          </w:tcPr>
+          <w:p>
+            <w:pPr>
+              <w:rPr>
+                <w:rFonts w:ascii="Times New Roman" w:hAnsi="Times New Roman" w:cs="Times New Roman"/>
+                <w:sz w:val="26"/>
+                <w:szCs w:val="26"/>
+                <w:lang w:val="vi-VN"/>
+              </w:rPr>
+            </w:pPr>
+            <w:r>
+              <w:rPr>
+                <w:rFonts w:ascii="Times New Roman" w:hAnsi="Times New Roman" w:cs="Times New Roman"/>
+                <w:sz w:val="26"/>
+                <w:szCs w:val="26"/>
+              </w:rPr>
+              <w:t>Number of retry attempts</w:t>
             </w:r>
           </w:p>
         </w:tc>
@@ -5355,55 +5798,55 @@
                 <w:sz w:val="26"/>
                 <w:szCs w:val="26"/>
               </w:rPr>
-              <w:t>retry_count</w:t>
-            </w:r>
-          </w:p>
-        </w:tc>
-        <w:tc>
-          <w:tcPr>
-            <w:tcW w:w="3117" w:type="dxa"/>
-            <w:vAlign w:val="center"/>
-          </w:tcPr>
-          <w:p>
-            <w:pPr>
-              <w:rPr>
-                <w:rFonts w:ascii="Times New Roman" w:hAnsi="Times New Roman" w:cs="Times New Roman"/>
-                <w:sz w:val="26"/>
-                <w:szCs w:val="26"/>
-                <w:lang w:val="vi-VN"/>
-              </w:rPr>
-            </w:pPr>
-            <w:r>
-              <w:rPr>
-                <w:rFonts w:ascii="Times New Roman" w:hAnsi="Times New Roman" w:cs="Times New Roman"/>
-                <w:sz w:val="26"/>
-                <w:szCs w:val="26"/>
-              </w:rPr>
-              <w:t>int</w:t>
-            </w:r>
-          </w:p>
-        </w:tc>
-        <w:tc>
-          <w:tcPr>
-            <w:tcW w:w="3117" w:type="dxa"/>
-            <w:vAlign w:val="center"/>
-          </w:tcPr>
-          <w:p>
-            <w:pPr>
-              <w:rPr>
-                <w:rFonts w:ascii="Times New Roman" w:hAnsi="Times New Roman" w:cs="Times New Roman"/>
-                <w:sz w:val="26"/>
-                <w:szCs w:val="26"/>
-                <w:lang w:val="vi-VN"/>
-              </w:rPr>
-            </w:pPr>
-            <w:r>
-              <w:rPr>
-                <w:rFonts w:ascii="Times New Roman" w:hAnsi="Times New Roman" w:cs="Times New Roman"/>
-                <w:sz w:val="26"/>
-                <w:szCs w:val="26"/>
-              </w:rPr>
-              <w:t>Number of retry attempts</w:t>
+              <w:t>last_retry_at</w:t>
+            </w:r>
+          </w:p>
+        </w:tc>
+        <w:tc>
+          <w:tcPr>
+            <w:tcW w:w="3117" w:type="dxa"/>
+            <w:vAlign w:val="center"/>
+          </w:tcPr>
+          <w:p>
+            <w:pPr>
+              <w:rPr>
+                <w:rFonts w:ascii="Times New Roman" w:hAnsi="Times New Roman" w:cs="Times New Roman"/>
+                <w:sz w:val="26"/>
+                <w:szCs w:val="26"/>
+                <w:lang w:val="vi-VN"/>
+              </w:rPr>
+            </w:pPr>
+            <w:r>
+              <w:rPr>
+                <w:rFonts w:ascii="Times New Roman" w:hAnsi="Times New Roman" w:cs="Times New Roman"/>
+                <w:sz w:val="26"/>
+                <w:szCs w:val="26"/>
+              </w:rPr>
+              <w:t>timestamp</w:t>
+            </w:r>
+          </w:p>
+        </w:tc>
+        <w:tc>
+          <w:tcPr>
+            <w:tcW w:w="3117" w:type="dxa"/>
+            <w:vAlign w:val="center"/>
+          </w:tcPr>
+          <w:p>
+            <w:pPr>
+              <w:rPr>
+                <w:rFonts w:ascii="Times New Roman" w:hAnsi="Times New Roman" w:cs="Times New Roman"/>
+                <w:sz w:val="26"/>
+                <w:szCs w:val="26"/>
+                <w:lang w:val="vi-VN"/>
+              </w:rPr>
+            </w:pPr>
+            <w:r>
+              <w:rPr>
+                <w:rFonts w:ascii="Times New Roman" w:hAnsi="Times New Roman" w:cs="Times New Roman"/>
+                <w:sz w:val="26"/>
+                <w:szCs w:val="26"/>
+              </w:rPr>
+              <w:t>Timestamp of the latest retry attempt</w:t>
             </w:r>
           </w:p>
         </w:tc>
@@ -5429,7 +5872,7 @@
                 <w:sz w:val="26"/>
                 <w:szCs w:val="26"/>
               </w:rPr>
-              <w:t>last_retry_at</w:t>
+              <w:t>created_at</w:t>
             </w:r>
           </w:p>
         </w:tc>
@@ -5477,7 +5920,7 @@
                 <w:sz w:val="26"/>
                 <w:szCs w:val="26"/>
               </w:rPr>
-              <w:t>Timestamp of the latest retry attempt</w:t>
+              <w:t>Record creation timestamp</w:t>
             </w:r>
           </w:p>
         </w:tc>
@@ -5503,80 +5946,6 @@
                 <w:sz w:val="26"/>
                 <w:szCs w:val="26"/>
               </w:rPr>
-              <w:t>created_at</w:t>
-            </w:r>
-          </w:p>
-        </w:tc>
-        <w:tc>
-          <w:tcPr>
-            <w:tcW w:w="3117" w:type="dxa"/>
-            <w:vAlign w:val="center"/>
-          </w:tcPr>
-          <w:p>
-            <w:pPr>
-              <w:rPr>
-                <w:rFonts w:ascii="Times New Roman" w:hAnsi="Times New Roman" w:cs="Times New Roman"/>
-                <w:sz w:val="26"/>
-                <w:szCs w:val="26"/>
-                <w:lang w:val="vi-VN"/>
-              </w:rPr>
-            </w:pPr>
-            <w:r>
-              <w:rPr>
-                <w:rFonts w:ascii="Times New Roman" w:hAnsi="Times New Roman" w:cs="Times New Roman"/>
-                <w:sz w:val="26"/>
-                <w:szCs w:val="26"/>
-              </w:rPr>
-              <w:t>timestamp</w:t>
-            </w:r>
-          </w:p>
-        </w:tc>
-        <w:tc>
-          <w:tcPr>
-            <w:tcW w:w="3117" w:type="dxa"/>
-            <w:vAlign w:val="center"/>
-          </w:tcPr>
-          <w:p>
-            <w:pPr>
-              <w:rPr>
-                <w:rFonts w:ascii="Times New Roman" w:hAnsi="Times New Roman" w:cs="Times New Roman"/>
-                <w:sz w:val="26"/>
-                <w:szCs w:val="26"/>
-                <w:lang w:val="vi-VN"/>
-              </w:rPr>
-            </w:pPr>
-            <w:r>
-              <w:rPr>
-                <w:rFonts w:ascii="Times New Roman" w:hAnsi="Times New Roman" w:cs="Times New Roman"/>
-                <w:sz w:val="26"/>
-                <w:szCs w:val="26"/>
-              </w:rPr>
-              <w:t>Record creation timestamp</w:t>
-            </w:r>
-          </w:p>
-        </w:tc>
-      </w:tr>
-      <w:tr>
-        <w:tc>
-          <w:tcPr>
-            <w:tcW w:w="3116" w:type="dxa"/>
-            <w:vAlign w:val="center"/>
-          </w:tcPr>
-          <w:p>
-            <w:pPr>
-              <w:rPr>
-                <w:rFonts w:ascii="Times New Roman" w:hAnsi="Times New Roman" w:cs="Times New Roman"/>
-                <w:sz w:val="26"/>
-                <w:szCs w:val="26"/>
-                <w:lang w:val="vi-VN"/>
-              </w:rPr>
-            </w:pPr>
-            <w:r>
-              <w:rPr>
-                <w:rFonts w:ascii="Times New Roman" w:hAnsi="Times New Roman" w:cs="Times New Roman"/>
-                <w:sz w:val="26"/>
-                <w:szCs w:val="26"/>
-              </w:rPr>
               <w:t>updated_at</w:t>
             </w:r>
           </w:p>
@@ -5631,6 +6000,18 @@
         </w:tc>
       </w:tr>
     </w:tbl>
+    <w:p>
+      <w:pPr>
+        <w:rPr>
+          <w:rFonts w:ascii="Times New Roman" w:hAnsi="Times New Roman" w:cs="Times New Roman"/>
+          <w:b/>
+          <w:bCs/>
+          <w:sz w:val="26"/>
+          <w:szCs w:val="26"/>
+          <w:lang w:val="vi-VN"/>
+        </w:rPr>
+      </w:pPr>
+    </w:p>
     <w:p>
       <w:pPr>
         <w:pStyle w:val="ListParagraph"/>
@@ -5656,6 +6037,7 @@
           <w:szCs w:val="26"/>
           <w:lang w:val="vi-VN"/>
         </w:rPr>
+        <w:lastRenderedPageBreak/>
         <w:t>log.audit_detail</w:t>
       </w:r>
     </w:p>
@@ -5687,16 +6069,7 @@
           <w:szCs w:val="26"/>
           <w:lang w:val="vi-VN"/>
         </w:rPr>
-        <w:t xml:space="preserve"> Stores processing metrics and execution details for each table and </w:t>
-      </w:r>
-      <w:r>
-        <w:rPr>
-          <w:rFonts w:ascii="Times New Roman" w:hAnsi="Times New Roman" w:cs="Times New Roman"/>
-          <w:sz w:val="26"/>
-          <w:szCs w:val="26"/>
-          <w:lang w:val="vi-VN"/>
-        </w:rPr>
-        <w:t>layer.</w:t>
+        <w:t xml:space="preserve"> Stores processing metrics and execution details for each table and layer.</w:t>
       </w:r>
     </w:p>
     <w:tbl>
@@ -6745,39 +7118,8 @@
           <w:szCs w:val="26"/>
           <w:lang w:val="vi-VN"/>
         </w:rPr>
-        <w:t xml:space="preserve"> Stores retry execution history for failed processing </w:t>
+        <w:t xml:space="preserve"> Stores retry execution history for failed processing attempts.</w:t>
       </w:r>
-      <w:r>
-        <w:rPr>
-          <w:rFonts w:ascii="Times New Roman" w:hAnsi="Times New Roman" w:cs="Times New Roman"/>
-          <w:sz w:val="26"/>
-          <w:szCs w:val="26"/>
-          <w:lang w:val="vi-VN"/>
-        </w:rPr>
-        <w:t>attempts.</w:t>
-      </w:r>
-    </w:p>
-    <w:p>
-      <w:pPr>
-        <w:ind w:firstLine="720"/>
-        <w:rPr>
-          <w:rFonts w:ascii="Times New Roman" w:hAnsi="Times New Roman" w:cs="Times New Roman"/>
-          <w:sz w:val="26"/>
-          <w:szCs w:val="26"/>
-          <w:lang w:val="vi-VN"/>
-        </w:rPr>
-      </w:pPr>
-    </w:p>
-    <w:p>
-      <w:pPr>
-        <w:ind w:firstLine="720"/>
-        <w:rPr>
-          <w:rFonts w:ascii="Times New Roman" w:hAnsi="Times New Roman" w:cs="Times New Roman"/>
-          <w:sz w:val="26"/>
-          <w:szCs w:val="26"/>
-          <w:lang w:val="vi-VN"/>
-        </w:rPr>
-      </w:pPr>
     </w:p>
     <w:tbl>
       <w:tblPr>
@@ -6813,7 +7155,6 @@
                 <w:sz w:val="26"/>
                 <w:szCs w:val="26"/>
               </w:rPr>
-              <w:lastRenderedPageBreak/>
               <w:t>Column</w:t>
             </w:r>
           </w:p>
@@ -7571,6 +7912,7 @@
           <w:sz w:val="26"/>
           <w:szCs w:val="26"/>
         </w:rPr>
+        <w:lastRenderedPageBreak/>
         <w:t>log.invalid_record</w:t>
       </w:r>
     </w:p>
@@ -7600,15 +7942,7 @@
           <w:sz w:val="26"/>
           <w:szCs w:val="26"/>
         </w:rPr>
-        <w:t xml:space="preserve"> Stores records that fail validation or transformation rules during </w:t>
-      </w:r>
-      <w:r>
-        <w:rPr>
-          <w:rFonts w:ascii="Times New Roman" w:hAnsi="Times New Roman" w:cs="Times New Roman"/>
-          <w:sz w:val="26"/>
-          <w:szCs w:val="26"/>
-        </w:rPr>
-        <w:t>processing</w:t>
+        <w:t xml:space="preserve"> Stores records that fail validation or transformation rules during processing</w:t>
       </w:r>
       <w:r>
         <w:rPr>
@@ -8393,26 +8727,6 @@
     </w:p>
     <w:p>
       <w:pPr>
-        <w:rPr>
-          <w:rFonts w:ascii="Times New Roman" w:hAnsi="Times New Roman" w:cs="Times New Roman"/>
-          <w:sz w:val="26"/>
-          <w:szCs w:val="26"/>
-          <w:lang w:val="vi-VN"/>
-        </w:rPr>
-      </w:pPr>
-    </w:p>
-    <w:p>
-      <w:pPr>
-        <w:rPr>
-          <w:rFonts w:ascii="Times New Roman" w:hAnsi="Times New Roman" w:cs="Times New Roman"/>
-          <w:sz w:val="26"/>
-          <w:szCs w:val="26"/>
-          <w:lang w:val="vi-VN"/>
-        </w:rPr>
-      </w:pPr>
-    </w:p>
-    <w:p>
-      <w:pPr>
         <w:pStyle w:val="ListParagraph"/>
         <w:numPr>
           <w:ilvl w:val="0"/>
@@ -8436,36 +8750,7 @@
           <w:szCs w:val="26"/>
           <w:lang w:val="vi-VN"/>
         </w:rPr>
-        <w:lastRenderedPageBreak/>
-        <w:t>Incremental Load Strategy Options</w:t>
-      </w:r>
-    </w:p>
-    <w:p>
-      <w:pPr>
-        <w:pStyle w:val="ListParagraph"/>
-        <w:numPr>
-          <w:ilvl w:val="1"/>
-          <w:numId w:val="6"/>
-        </w:numPr>
-        <w:rPr>
-          <w:rFonts w:ascii="Times New Roman" w:hAnsi="Times New Roman" w:cs="Times New Roman"/>
-          <w:b/>
-          <w:bCs/>
-          <w:sz w:val="26"/>
-          <w:szCs w:val="26"/>
-          <w:lang w:val="vi-VN"/>
-        </w:rPr>
-      </w:pPr>
-      <w:r>
-        <w:rPr>
-          <w:rFonts w:ascii="Times New Roman" w:hAnsi="Times New Roman" w:cs="Times New Roman"/>
-          <w:b/>
-          <w:bCs/>
-          <w:sz w:val="26"/>
-          <w:szCs w:val="26"/>
-          <w:lang w:val="vi-VN"/>
-        </w:rPr>
-        <w:t>Option 1: Layer Timestamp Checkpoint</w:t>
+        <w:t>Incremental Load Strategy</w:t>
       </w:r>
     </w:p>
     <w:p>
@@ -8509,7 +8794,7 @@
           <w:szCs w:val="26"/>
           <w:lang w:val="vi-VN"/>
         </w:rPr>
-        <w:t>Read source records where watermark_column &gt; watermark_value.</w:t>
+        <w:t>Use watermark_column &gt; watermark_value.</w:t>
       </w:r>
     </w:p>
     <w:p>
@@ -8529,16 +8814,30 @@
           <w:szCs w:val="26"/>
           <w:lang w:val="vi-VN"/>
         </w:rPr>
-        <w:t>After Bronze succeeds:</w:t>
+        <w:t xml:space="preserve">Assign </w:t>
+      </w:r>
+      <w:r>
+        <w:rPr>
+          <w:rFonts w:ascii="Times New Roman" w:hAnsi="Times New Roman" w:cs="Times New Roman"/>
+          <w:sz w:val="26"/>
+          <w:szCs w:val="26"/>
+          <w:lang w:val="vi-VN"/>
+        </w:rPr>
+        <w:t xml:space="preserve"> </w:t>
+      </w:r>
+      <w:r>
+        <w:rPr>
+          <w:rFonts w:ascii="Times New Roman" w:hAnsi="Times New Roman" w:cs="Times New Roman"/>
+          <w:sz w:val="26"/>
+          <w:szCs w:val="26"/>
+          <w:lang w:val="vi-VN"/>
+        </w:rPr>
+        <w:t>_batch_id to all records loaded into Bronze.</w:t>
       </w:r>
     </w:p>
     <w:p>
       <w:pPr>
-        <w:pStyle w:val="ListParagraph"/>
-        <w:numPr>
-          <w:ilvl w:val="0"/>
-          <w:numId w:val="7"/>
-        </w:numPr>
+        <w:ind w:left="720"/>
         <w:rPr>
           <w:rFonts w:ascii="Times New Roman" w:hAnsi="Times New Roman" w:cs="Times New Roman"/>
           <w:sz w:val="26"/>
@@ -8553,7 +8852,25 @@
           <w:szCs w:val="26"/>
           <w:lang w:val="vi-VN"/>
         </w:rPr>
-        <w:t>watermark_value = MAX(source.watermark_column).</w:t>
+        <w:t>After Bronze succeeds, update watermark_value =</w:t>
+      </w:r>
+      <w:r>
+        <w:rPr>
+          <w:rFonts w:ascii="Times New Roman" w:hAnsi="Times New Roman" w:cs="Times New Roman"/>
+          <w:sz w:val="26"/>
+          <w:szCs w:val="26"/>
+          <w:lang w:val="vi-VN"/>
+        </w:rPr>
+        <w:t xml:space="preserve"> </w:t>
+      </w:r>
+      <w:r>
+        <w:rPr>
+          <w:rFonts w:ascii="Times New Roman" w:hAnsi="Times New Roman" w:cs="Times New Roman"/>
+          <w:sz w:val="26"/>
+          <w:szCs w:val="26"/>
+          <w:lang w:val="vi-VN"/>
+        </w:rPr>
+        <w:t>MAX(source.watermark_column).</w:t>
       </w:r>
     </w:p>
     <w:p>
@@ -8597,51 +8914,7 @@
           <w:szCs w:val="26"/>
           <w:lang w:val="vi-VN"/>
         </w:rPr>
-        <w:t>Read Bronze records where bronze._loaded_at &gt; last_silver_success_at.</w:t>
-      </w:r>
-    </w:p>
-    <w:p>
-      <w:pPr>
-        <w:ind w:left="720"/>
-        <w:rPr>
-          <w:rFonts w:ascii="Times New Roman" w:hAnsi="Times New Roman" w:cs="Times New Roman"/>
-          <w:sz w:val="26"/>
-          <w:szCs w:val="26"/>
-          <w:lang w:val="vi-VN"/>
-        </w:rPr>
-      </w:pPr>
-      <w:r>
-        <w:rPr>
-          <w:rFonts w:ascii="Times New Roman" w:hAnsi="Times New Roman" w:cs="Times New Roman"/>
-          <w:sz w:val="26"/>
-          <w:szCs w:val="26"/>
-          <w:lang w:val="vi-VN"/>
-        </w:rPr>
-        <w:t>After Silver succeeds:</w:t>
-      </w:r>
-    </w:p>
-    <w:p>
-      <w:pPr>
-        <w:pStyle w:val="ListParagraph"/>
-        <w:numPr>
-          <w:ilvl w:val="0"/>
-          <w:numId w:val="7"/>
-        </w:numPr>
-        <w:rPr>
-          <w:rFonts w:ascii="Times New Roman" w:hAnsi="Times New Roman" w:cs="Times New Roman"/>
-          <w:sz w:val="26"/>
-          <w:szCs w:val="26"/>
-          <w:lang w:val="vi-VN"/>
-        </w:rPr>
-      </w:pPr>
-      <w:r>
-        <w:rPr>
-          <w:rFonts w:ascii="Times New Roman" w:hAnsi="Times New Roman" w:cs="Times New Roman"/>
-          <w:sz w:val="26"/>
-          <w:szCs w:val="26"/>
-          <w:lang w:val="vi-VN"/>
-        </w:rPr>
-        <w:t>last_silver_success_at = CURRENT_TIMESTAMP.</w:t>
+        <w:t xml:space="preserve">  Read Bronze records by _batch_id.</w:t>
       </w:r>
     </w:p>
     <w:p>
@@ -8685,574 +8958,7 @@
           <w:szCs w:val="26"/>
           <w:lang w:val="vi-VN"/>
         </w:rPr>
-        <w:t>Read Silver records where silver._loaded_at &gt; last_gold_success_at.</w:t>
-      </w:r>
-    </w:p>
-    <w:p>
-      <w:pPr>
-        <w:ind w:left="720"/>
-        <w:rPr>
-          <w:rFonts w:ascii="Times New Roman" w:hAnsi="Times New Roman" w:cs="Times New Roman"/>
-          <w:sz w:val="26"/>
-          <w:szCs w:val="26"/>
-          <w:lang w:val="vi-VN"/>
-        </w:rPr>
-      </w:pPr>
-      <w:r>
-        <w:rPr>
-          <w:rFonts w:ascii="Times New Roman" w:hAnsi="Times New Roman" w:cs="Times New Roman"/>
-          <w:sz w:val="26"/>
-          <w:szCs w:val="26"/>
-          <w:lang w:val="vi-VN"/>
-        </w:rPr>
-        <w:t>After Gold succeeds:</w:t>
-      </w:r>
-    </w:p>
-    <w:p>
-      <w:pPr>
-        <w:pStyle w:val="ListParagraph"/>
-        <w:numPr>
-          <w:ilvl w:val="0"/>
-          <w:numId w:val="7"/>
-        </w:numPr>
-        <w:rPr>
-          <w:rFonts w:ascii="Times New Roman" w:hAnsi="Times New Roman" w:cs="Times New Roman"/>
-          <w:sz w:val="26"/>
-          <w:szCs w:val="26"/>
-          <w:lang w:val="vi-VN"/>
-        </w:rPr>
-      </w:pPr>
-      <w:r>
-        <w:rPr>
-          <w:rFonts w:ascii="Times New Roman" w:hAnsi="Times New Roman" w:cs="Times New Roman"/>
-          <w:sz w:val="26"/>
-          <w:szCs w:val="26"/>
-          <w:lang w:val="vi-VN"/>
-        </w:rPr>
-        <w:t>last_gold_success_at = CURRENT_TIMESTAMP.</w:t>
-      </w:r>
-    </w:p>
-    <w:p>
-      <w:pPr>
-        <w:ind w:left="720"/>
-        <w:rPr>
-          <w:rFonts w:ascii="Times New Roman" w:hAnsi="Times New Roman" w:cs="Times New Roman"/>
-          <w:b/>
-          <w:bCs/>
-          <w:sz w:val="26"/>
-          <w:szCs w:val="26"/>
-          <w:lang w:val="vi-VN"/>
-        </w:rPr>
-      </w:pPr>
-      <w:r>
-        <w:rPr>
-          <w:rFonts w:ascii="Times New Roman" w:hAnsi="Times New Roman" w:cs="Times New Roman"/>
-          <w:b/>
-          <w:bCs/>
-          <w:sz w:val="26"/>
-          <w:szCs w:val="26"/>
-          <w:lang w:val="vi-VN"/>
-        </w:rPr>
-        <w:t>Advantages</w:t>
-      </w:r>
-      <w:r>
-        <w:rPr>
-          <w:rFonts w:ascii="Times New Roman" w:hAnsi="Times New Roman" w:cs="Times New Roman"/>
-          <w:b/>
-          <w:bCs/>
-          <w:sz w:val="26"/>
-          <w:szCs w:val="26"/>
-          <w:lang w:val="vi-VN"/>
-        </w:rPr>
-        <w:t>:</w:t>
-      </w:r>
-    </w:p>
-    <w:p>
-      <w:pPr>
-        <w:pStyle w:val="ListParagraph"/>
-        <w:numPr>
-          <w:ilvl w:val="0"/>
-          <w:numId w:val="8"/>
-        </w:numPr>
-        <w:rPr>
-          <w:rFonts w:ascii="Times New Roman" w:hAnsi="Times New Roman" w:cs="Times New Roman"/>
-          <w:sz w:val="26"/>
-          <w:szCs w:val="26"/>
-          <w:lang w:val="vi-VN"/>
-        </w:rPr>
-      </w:pPr>
-      <w:r>
-        <w:rPr>
-          <w:rFonts w:ascii="Times New Roman" w:hAnsi="Times New Roman" w:cs="Times New Roman"/>
-          <w:sz w:val="26"/>
-          <w:szCs w:val="26"/>
-          <w:lang w:val="vi-VN"/>
-        </w:rPr>
-        <w:t>Simple implementation.</w:t>
-      </w:r>
-    </w:p>
-    <w:p>
-      <w:pPr>
-        <w:pStyle w:val="ListParagraph"/>
-        <w:numPr>
-          <w:ilvl w:val="0"/>
-          <w:numId w:val="8"/>
-        </w:numPr>
-        <w:rPr>
-          <w:rFonts w:ascii="Times New Roman" w:hAnsi="Times New Roman" w:cs="Times New Roman"/>
-          <w:sz w:val="26"/>
-          <w:szCs w:val="26"/>
-          <w:lang w:val="vi-VN"/>
-        </w:rPr>
-      </w:pPr>
-      <w:r>
-        <w:rPr>
-          <w:rFonts w:ascii="Times New Roman" w:hAnsi="Times New Roman" w:cs="Times New Roman"/>
-          <w:sz w:val="26"/>
-          <w:szCs w:val="26"/>
-          <w:lang w:val="vi-VN"/>
-        </w:rPr>
-        <w:t>No additional batch tracking is required</w:t>
-      </w:r>
-      <w:r>
-        <w:rPr>
-          <w:rFonts w:ascii="Times New Roman" w:hAnsi="Times New Roman" w:cs="Times New Roman"/>
-          <w:sz w:val="26"/>
-          <w:szCs w:val="26"/>
-          <w:lang w:val="vi-VN"/>
-        </w:rPr>
-        <w:t>.</w:t>
-      </w:r>
-    </w:p>
-    <w:p>
-      <w:pPr>
-        <w:ind w:left="720"/>
-        <w:rPr>
-          <w:rFonts w:ascii="Times New Roman" w:hAnsi="Times New Roman" w:cs="Times New Roman"/>
-          <w:b/>
-          <w:bCs/>
-          <w:sz w:val="26"/>
-          <w:szCs w:val="26"/>
-          <w:lang w:val="vi-VN"/>
-        </w:rPr>
-      </w:pPr>
-      <w:r>
-        <w:rPr>
-          <w:rFonts w:ascii="Times New Roman" w:hAnsi="Times New Roman" w:cs="Times New Roman"/>
-          <w:b/>
-          <w:bCs/>
-          <w:sz w:val="26"/>
-          <w:szCs w:val="26"/>
-          <w:lang w:val="vi-VN"/>
-        </w:rPr>
-        <w:t>Disadvantages</w:t>
-      </w:r>
-      <w:r>
-        <w:rPr>
-          <w:rFonts w:ascii="Times New Roman" w:hAnsi="Times New Roman" w:cs="Times New Roman"/>
-          <w:b/>
-          <w:bCs/>
-          <w:sz w:val="26"/>
-          <w:szCs w:val="26"/>
-          <w:lang w:val="vi-VN"/>
-        </w:rPr>
-        <w:t>:</w:t>
-      </w:r>
-    </w:p>
-    <w:p>
-      <w:pPr>
-        <w:pStyle w:val="ListParagraph"/>
-        <w:numPr>
-          <w:ilvl w:val="0"/>
-          <w:numId w:val="9"/>
-        </w:numPr>
-        <w:rPr>
-          <w:rFonts w:ascii="Times New Roman" w:hAnsi="Times New Roman" w:cs="Times New Roman"/>
-          <w:sz w:val="26"/>
-          <w:szCs w:val="26"/>
-          <w:lang w:val="vi-VN"/>
-        </w:rPr>
-      </w:pPr>
-      <w:r>
-        <w:rPr>
-          <w:rFonts w:ascii="Times New Roman" w:hAnsi="Times New Roman" w:cs="Times New Roman"/>
-          <w:sz w:val="26"/>
-          <w:szCs w:val="26"/>
-          <w:lang w:val="vi-VN"/>
-        </w:rPr>
-        <w:t>Requires maintaining separate checkpoints for Silver and Gold.</w:t>
-      </w:r>
-    </w:p>
-    <w:p>
-      <w:pPr>
-        <w:pStyle w:val="ListParagraph"/>
-        <w:numPr>
-          <w:ilvl w:val="1"/>
-          <w:numId w:val="6"/>
-        </w:numPr>
-        <w:rPr>
-          <w:rFonts w:ascii="Times New Roman" w:hAnsi="Times New Roman" w:cs="Times New Roman"/>
-          <w:b/>
-          <w:bCs/>
-          <w:sz w:val="26"/>
-          <w:szCs w:val="26"/>
-          <w:lang w:val="vi-VN"/>
-        </w:rPr>
-      </w:pPr>
-      <w:r>
-        <w:rPr>
-          <w:rFonts w:ascii="Times New Roman" w:hAnsi="Times New Roman" w:cs="Times New Roman"/>
-          <w:b/>
-          <w:bCs/>
-          <w:sz w:val="26"/>
-          <w:szCs w:val="26"/>
-          <w:lang w:val="vi-VN"/>
-        </w:rPr>
-        <w:t>Option 2: Batch ID Based Processing</w:t>
-      </w:r>
-    </w:p>
-    <w:p>
-      <w:pPr>
-        <w:ind w:left="720"/>
-        <w:rPr>
-          <w:rFonts w:ascii="Times New Roman" w:hAnsi="Times New Roman" w:cs="Times New Roman"/>
-          <w:b/>
-          <w:bCs/>
-          <w:sz w:val="26"/>
-          <w:szCs w:val="26"/>
-          <w:lang w:val="vi-VN"/>
-        </w:rPr>
-      </w:pPr>
-      <w:r>
-        <w:rPr>
-          <w:rFonts w:ascii="Times New Roman" w:hAnsi="Times New Roman" w:cs="Times New Roman"/>
-          <w:b/>
-          <w:bCs/>
-          <w:sz w:val="26"/>
-          <w:szCs w:val="26"/>
-          <w:lang w:val="vi-VN"/>
-        </w:rPr>
-        <w:t>Source → Bronze:</w:t>
-      </w:r>
-    </w:p>
-    <w:p>
-      <w:pPr>
-        <w:ind w:left="720"/>
-        <w:rPr>
-          <w:rFonts w:ascii="Times New Roman" w:hAnsi="Times New Roman" w:cs="Times New Roman"/>
-          <w:sz w:val="26"/>
-          <w:szCs w:val="26"/>
-          <w:lang w:val="vi-VN"/>
-        </w:rPr>
-      </w:pPr>
-      <w:r>
-        <w:rPr>
-          <w:rFonts w:ascii="Times New Roman" w:hAnsi="Times New Roman" w:cs="Times New Roman"/>
-          <w:sz w:val="26"/>
-          <w:szCs w:val="26"/>
-          <w:lang w:val="vi-VN"/>
-        </w:rPr>
-        <w:t>Use watermark_column &gt; watermark_value.</w:t>
-      </w:r>
-    </w:p>
-    <w:p>
-      <w:pPr>
-        <w:ind w:left="720"/>
-        <w:rPr>
-          <w:rFonts w:ascii="Times New Roman" w:hAnsi="Times New Roman" w:cs="Times New Roman"/>
-          <w:sz w:val="26"/>
-          <w:szCs w:val="26"/>
-          <w:lang w:val="vi-VN"/>
-        </w:rPr>
-      </w:pPr>
-      <w:r>
-        <w:rPr>
-          <w:rFonts w:ascii="Times New Roman" w:hAnsi="Times New Roman" w:cs="Times New Roman"/>
-          <w:sz w:val="26"/>
-          <w:szCs w:val="26"/>
-          <w:lang w:val="vi-VN"/>
-        </w:rPr>
-        <w:t>Assign _batch_id to all records loaded into Bronze.</w:t>
-      </w:r>
-    </w:p>
-    <w:p>
-      <w:pPr>
-        <w:ind w:left="720"/>
-        <w:rPr>
-          <w:rFonts w:ascii="Times New Roman" w:hAnsi="Times New Roman" w:cs="Times New Roman"/>
-          <w:sz w:val="26"/>
-          <w:szCs w:val="26"/>
-          <w:lang w:val="vi-VN"/>
-        </w:rPr>
-      </w:pPr>
-      <w:r>
-        <w:rPr>
-          <w:rFonts w:ascii="Times New Roman" w:hAnsi="Times New Roman" w:cs="Times New Roman"/>
-          <w:sz w:val="26"/>
-          <w:szCs w:val="26"/>
-          <w:lang w:val="vi-VN"/>
-        </w:rPr>
-        <w:t>After Bronze succeeds, update watermark_value =</w:t>
-      </w:r>
-      <w:r>
-        <w:rPr>
-          <w:rFonts w:ascii="Times New Roman" w:hAnsi="Times New Roman" w:cs="Times New Roman"/>
-          <w:sz w:val="26"/>
-          <w:szCs w:val="26"/>
-          <w:lang w:val="vi-VN"/>
-        </w:rPr>
-        <w:t xml:space="preserve"> </w:t>
-      </w:r>
-      <w:r>
-        <w:rPr>
-          <w:rFonts w:ascii="Times New Roman" w:hAnsi="Times New Roman" w:cs="Times New Roman"/>
-          <w:sz w:val="26"/>
-          <w:szCs w:val="26"/>
-          <w:lang w:val="vi-VN"/>
-        </w:rPr>
-        <w:t>MAX(source.watermark_column).</w:t>
-      </w:r>
-    </w:p>
-    <w:p>
-      <w:pPr>
-        <w:ind w:left="720"/>
-        <w:rPr>
-          <w:rFonts w:ascii="Times New Roman" w:hAnsi="Times New Roman" w:cs="Times New Roman"/>
-          <w:b/>
-          <w:bCs/>
-          <w:sz w:val="26"/>
-          <w:szCs w:val="26"/>
-          <w:lang w:val="vi-VN"/>
-        </w:rPr>
-      </w:pPr>
-      <w:r>
-        <w:rPr>
-          <w:rFonts w:ascii="Times New Roman" w:hAnsi="Times New Roman" w:cs="Times New Roman"/>
-          <w:b/>
-          <w:bCs/>
-          <w:sz w:val="26"/>
-          <w:szCs w:val="26"/>
-          <w:lang w:val="vi-VN"/>
-        </w:rPr>
-        <w:t>Bronze → Silver:</w:t>
-      </w:r>
-    </w:p>
-    <w:p>
-      <w:pPr>
-        <w:ind w:left="720"/>
-        <w:rPr>
-          <w:rFonts w:ascii="Times New Roman" w:hAnsi="Times New Roman" w:cs="Times New Roman"/>
-          <w:sz w:val="26"/>
-          <w:szCs w:val="26"/>
-          <w:lang w:val="vi-VN"/>
-        </w:rPr>
-      </w:pPr>
-      <w:r>
-        <w:rPr>
-          <w:rFonts w:ascii="Times New Roman" w:hAnsi="Times New Roman" w:cs="Times New Roman"/>
-          <w:sz w:val="26"/>
-          <w:szCs w:val="26"/>
-          <w:lang w:val="vi-VN"/>
-        </w:rPr>
-        <w:t xml:space="preserve">  Read Bronze records by _batch_id.</w:t>
-      </w:r>
-    </w:p>
-    <w:p>
-      <w:pPr>
-        <w:ind w:left="720"/>
-        <w:rPr>
-          <w:rFonts w:ascii="Times New Roman" w:hAnsi="Times New Roman" w:cs="Times New Roman"/>
-          <w:b/>
-          <w:bCs/>
-          <w:sz w:val="26"/>
-          <w:szCs w:val="26"/>
-          <w:lang w:val="vi-VN"/>
-        </w:rPr>
-      </w:pPr>
-      <w:r>
-        <w:rPr>
-          <w:rFonts w:ascii="Times New Roman" w:hAnsi="Times New Roman" w:cs="Times New Roman"/>
-          <w:b/>
-          <w:bCs/>
-          <w:sz w:val="26"/>
-          <w:szCs w:val="26"/>
-          <w:lang w:val="vi-VN"/>
-        </w:rPr>
-        <w:lastRenderedPageBreak/>
-        <w:t>Silver → Gold:</w:t>
-      </w:r>
-    </w:p>
-    <w:p>
-      <w:pPr>
-        <w:ind w:left="720"/>
-        <w:rPr>
-          <w:rFonts w:ascii="Times New Roman" w:hAnsi="Times New Roman" w:cs="Times New Roman"/>
-          <w:sz w:val="26"/>
-          <w:szCs w:val="26"/>
-          <w:lang w:val="vi-VN"/>
-        </w:rPr>
-      </w:pPr>
-      <w:r>
-        <w:rPr>
-          <w:rFonts w:ascii="Times New Roman" w:hAnsi="Times New Roman" w:cs="Times New Roman"/>
-          <w:sz w:val="26"/>
-          <w:szCs w:val="26"/>
-          <w:lang w:val="vi-VN"/>
-        </w:rPr>
         <w:t>Read Silver records by _batch_id.</w:t>
-      </w:r>
-    </w:p>
-    <w:p>
-      <w:pPr>
-        <w:ind w:left="720"/>
-        <w:rPr>
-          <w:rFonts w:ascii="Times New Roman" w:hAnsi="Times New Roman" w:cs="Times New Roman"/>
-          <w:b/>
-          <w:bCs/>
-          <w:sz w:val="26"/>
-          <w:szCs w:val="26"/>
-          <w:lang w:val="vi-VN"/>
-        </w:rPr>
-      </w:pPr>
-      <w:r>
-        <w:rPr>
-          <w:rFonts w:ascii="Times New Roman" w:hAnsi="Times New Roman" w:cs="Times New Roman"/>
-          <w:b/>
-          <w:bCs/>
-          <w:sz w:val="26"/>
-          <w:szCs w:val="26"/>
-          <w:lang w:val="vi-VN"/>
-        </w:rPr>
-        <w:t>Advantages</w:t>
-      </w:r>
-      <w:r>
-        <w:rPr>
-          <w:rFonts w:ascii="Times New Roman" w:hAnsi="Times New Roman" w:cs="Times New Roman"/>
-          <w:b/>
-          <w:bCs/>
-          <w:sz w:val="26"/>
-          <w:szCs w:val="26"/>
-          <w:lang w:val="vi-VN"/>
-        </w:rPr>
-        <w:t>:</w:t>
-      </w:r>
-    </w:p>
-    <w:p>
-      <w:pPr>
-        <w:pStyle w:val="ListParagraph"/>
-        <w:numPr>
-          <w:ilvl w:val="0"/>
-          <w:numId w:val="10"/>
-        </w:numPr>
-        <w:rPr>
-          <w:rFonts w:ascii="Times New Roman" w:hAnsi="Times New Roman" w:cs="Times New Roman"/>
-          <w:sz w:val="26"/>
-          <w:szCs w:val="26"/>
-          <w:lang w:val="vi-VN"/>
-        </w:rPr>
-      </w:pPr>
-      <w:r>
-        <w:rPr>
-          <w:rFonts w:ascii="Times New Roman" w:hAnsi="Times New Roman" w:cs="Times New Roman"/>
-          <w:sz w:val="26"/>
-          <w:szCs w:val="26"/>
-          <w:lang w:val="vi-VN"/>
-        </w:rPr>
-        <w:t>Clear batch-level lineage across Bronze, Silver, and Gold.</w:t>
-      </w:r>
-    </w:p>
-    <w:p>
-      <w:pPr>
-        <w:ind w:left="720"/>
-        <w:rPr>
-          <w:rFonts w:ascii="Times New Roman" w:hAnsi="Times New Roman" w:cs="Times New Roman"/>
-          <w:b/>
-          <w:bCs/>
-          <w:sz w:val="26"/>
-          <w:szCs w:val="26"/>
-          <w:lang w:val="vi-VN"/>
-        </w:rPr>
-      </w:pPr>
-      <w:r>
-        <w:rPr>
-          <w:rFonts w:ascii="Times New Roman" w:hAnsi="Times New Roman" w:cs="Times New Roman"/>
-          <w:b/>
-          <w:bCs/>
-          <w:sz w:val="26"/>
-          <w:szCs w:val="26"/>
-          <w:lang w:val="vi-VN"/>
-        </w:rPr>
-        <w:t>D</w:t>
-      </w:r>
-      <w:r>
-        <w:rPr>
-          <w:rFonts w:ascii="Times New Roman" w:hAnsi="Times New Roman" w:cs="Times New Roman"/>
-          <w:b/>
-          <w:bCs/>
-          <w:sz w:val="26"/>
-          <w:szCs w:val="26"/>
-          <w:lang w:val="vi-VN"/>
-        </w:rPr>
-        <w:t>isadvantage</w:t>
-      </w:r>
-      <w:r>
-        <w:rPr>
-          <w:rFonts w:ascii="Times New Roman" w:hAnsi="Times New Roman" w:cs="Times New Roman"/>
-          <w:b/>
-          <w:bCs/>
-          <w:sz w:val="26"/>
-          <w:szCs w:val="26"/>
-          <w:lang w:val="vi-VN"/>
-        </w:rPr>
-        <w:t>:</w:t>
-      </w:r>
-    </w:p>
-    <w:p>
-      <w:pPr>
-        <w:pStyle w:val="ListParagraph"/>
-        <w:numPr>
-          <w:ilvl w:val="0"/>
-          <w:numId w:val="10"/>
-        </w:numPr>
-        <w:rPr>
-          <w:rFonts w:ascii="Times New Roman" w:hAnsi="Times New Roman" w:cs="Times New Roman"/>
-          <w:sz w:val="26"/>
-          <w:szCs w:val="26"/>
-          <w:lang w:val="vi-VN"/>
-        </w:rPr>
-      </w:pPr>
-      <w:r>
-        <w:rPr>
-          <w:rFonts w:ascii="Times New Roman" w:hAnsi="Times New Roman" w:cs="Times New Roman"/>
-          <w:sz w:val="26"/>
-          <w:szCs w:val="26"/>
-          <w:lang w:val="vi-VN"/>
-        </w:rPr>
-        <w:t>Requires batch_id management.</w:t>
-      </w:r>
-    </w:p>
-    <w:p>
-      <w:pPr>
-        <w:pStyle w:val="ListParagraph"/>
-        <w:numPr>
-          <w:ilvl w:val="0"/>
-          <w:numId w:val="11"/>
-        </w:numPr>
-        <w:rPr>
-          <w:rFonts w:ascii="Times New Roman" w:hAnsi="Times New Roman" w:cs="Times New Roman"/>
-          <w:sz w:val="26"/>
-          <w:szCs w:val="26"/>
-          <w:lang w:val="vi-VN"/>
-        </w:rPr>
-      </w:pPr>
-      <w:r>
-        <w:rPr>
-          <w:rFonts w:ascii="Times New Roman" w:hAnsi="Times New Roman" w:cs="Times New Roman"/>
-          <w:sz w:val="26"/>
-          <w:szCs w:val="26"/>
-          <w:lang w:val="vi-VN"/>
-        </w:rPr>
-        <w:t>Batch ID is preferred because it avoids maintaining separate layer timestamp checkpoints and provides clearer batch-level lineage and recovery.</w:t>
       </w:r>
     </w:p>
     <w:p>
@@ -9311,7 +9017,7 @@
           <w:szCs w:val="26"/>
           <w:lang w:val="vi-VN"/>
         </w:rPr>
-        <w:t>Retry is used for transient system errors, not for data errors.</w:t>
+        <w:t>Retry is used for short-lived transient system errors, not for data errors.</w:t>
       </w:r>
     </w:p>
     <w:p>
@@ -9331,6 +9037,7 @@
           <w:szCs w:val="26"/>
           <w:lang w:val="vi-VN"/>
         </w:rPr>
+        <w:lastRenderedPageBreak/>
         <w:t>System errors include timeout, temporary connection failure, Spark execution failure, or storage write failure.</w:t>
       </w:r>
     </w:p>
@@ -9392,6 +9099,26 @@
           <w:lang w:val="vi-VN"/>
         </w:rPr>
         <w:t>Each retry attempt is logged in log.retry_log.</w:t>
+      </w:r>
+    </w:p>
+    <w:p>
+      <w:pPr>
+        <w:ind w:left="360"/>
+        <w:rPr>
+          <w:rFonts w:ascii="Times New Roman" w:hAnsi="Times New Roman" w:cs="Times New Roman"/>
+          <w:sz w:val="26"/>
+          <w:szCs w:val="26"/>
+          <w:lang w:val="vi-VN"/>
+        </w:rPr>
+      </w:pPr>
+      <w:r>
+        <w:rPr>
+          <w:rFonts w:ascii="Times New Roman" w:hAnsi="Times New Roman" w:cs="Times New Roman"/>
+          <w:sz w:val="26"/>
+          <w:szCs w:val="26"/>
+          <w:lang w:val="vi-VN"/>
+        </w:rPr>
+        <w:t>If the system error persists beyond the configured retry limit, recovery is required.</w:t>
       </w:r>
     </w:p>
     <w:p>
@@ -9490,6 +9217,26 @@
           <w:szCs w:val="26"/>
           <w:lang w:val="vi-VN"/>
         </w:rPr>
+        <w:t>Recovery is used to resume processing after a failed execution once the underlying issue has been resolved.</w:t>
+      </w:r>
+    </w:p>
+    <w:p>
+      <w:pPr>
+        <w:ind w:left="360"/>
+        <w:rPr>
+          <w:rFonts w:ascii="Times New Roman" w:hAnsi="Times New Roman" w:cs="Times New Roman"/>
+          <w:sz w:val="26"/>
+          <w:szCs w:val="26"/>
+          <w:lang w:val="vi-VN"/>
+        </w:rPr>
+      </w:pPr>
+      <w:r>
+        <w:rPr>
+          <w:rFonts w:ascii="Times New Roman" w:hAnsi="Times New Roman" w:cs="Times New Roman"/>
+          <w:sz w:val="26"/>
+          <w:szCs w:val="26"/>
+          <w:lang w:val="vi-VN"/>
+        </w:rPr>
         <w:t>A recovery run creates a new session_id and reuses the same batch_id.</w:t>
       </w:r>
     </w:p>
@@ -9500,6 +9247,7 @@
           <w:rFonts w:ascii="Times New Roman" w:hAnsi="Times New Roman" w:cs="Times New Roman"/>
           <w:sz w:val="26"/>
           <w:szCs w:val="26"/>
+          <w:lang w:val="vi-VN"/>
         </w:rPr>
       </w:pPr>
       <w:r>
@@ -9509,24 +9257,7 @@
           <w:szCs w:val="26"/>
           <w:lang w:val="vi-VN"/>
         </w:rPr>
-        <w:t xml:space="preserve">The failed batch_id is determined from </w:t>
-      </w:r>
-      <w:r>
-        <w:rPr>
-          <w:rFonts w:ascii="Times New Roman" w:hAnsi="Times New Roman" w:cs="Times New Roman"/>
-          <w:sz w:val="26"/>
-          <w:szCs w:val="26"/>
-        </w:rPr>
-        <w:t>log.audit_session</w:t>
-      </w:r>
-      <w:r>
-        <w:rPr>
-          <w:rFonts w:ascii="Times New Roman" w:hAnsi="Times New Roman" w:cs="Times New Roman"/>
-          <w:sz w:val="26"/>
-          <w:szCs w:val="26"/>
-          <w:lang w:val="vi-VN"/>
-        </w:rPr>
-        <w:t>.</w:t>
+        <w:t>The failed batch_id is determined from log.audit_session.</w:t>
       </w:r>
     </w:p>
     <w:p>
@@ -9566,7 +9297,7 @@
           <w:szCs w:val="26"/>
           <w:lang w:val="vi-VN"/>
         </w:rPr>
-        <w:t>The pipeline may be rerun from the beginning, but completed layers are skipped based on the audit status of the same batch_id.</w:t>
+        <w:t>The pipeline may be rerun from the beginning, but completed layers are skipped based on audit status so recovery resumes from the first failed layer.</w:t>
       </w:r>
     </w:p>
     <w:p>
@@ -9606,61 +9337,67 @@
           <w:szCs w:val="26"/>
           <w:lang w:val="vi-VN"/>
         </w:rPr>
-        <w:lastRenderedPageBreak/>
-        <w:t>Recovery resumes processing from the first failed layer.</w:t>
-      </w:r>
-    </w:p>
-    <w:p>
-      <w:pPr>
-        <w:ind w:left="360"/>
-        <w:rPr>
-          <w:rFonts w:ascii="Times New Roman" w:hAnsi="Times New Roman" w:cs="Times New Roman"/>
-          <w:sz w:val="26"/>
-          <w:szCs w:val="26"/>
-          <w:lang w:val="vi-VN"/>
-        </w:rPr>
-      </w:pPr>
-      <w:r>
-        <w:rPr>
-          <w:rFonts w:ascii="Times New Roman" w:hAnsi="Times New Roman" w:cs="Times New Roman"/>
-          <w:sz w:val="26"/>
-          <w:szCs w:val="26"/>
-          <w:lang w:val="vi-VN"/>
-        </w:rPr>
-        <w:t>R</w:t>
-      </w:r>
-      <w:r>
-        <w:rPr>
-          <w:rFonts w:ascii="Times New Roman" w:hAnsi="Times New Roman" w:cs="Times New Roman"/>
-          <w:sz w:val="26"/>
-          <w:szCs w:val="26"/>
-          <w:lang w:val="vi-VN"/>
-        </w:rPr>
-        <w:t>ecovery creates a new session_id.</w:t>
-      </w:r>
-    </w:p>
-    <w:p>
-      <w:pPr>
-        <w:ind w:left="360"/>
-        <w:rPr>
-          <w:rFonts w:ascii="Times New Roman" w:hAnsi="Times New Roman" w:cs="Times New Roman"/>
-          <w:sz w:val="26"/>
-          <w:szCs w:val="26"/>
-          <w:lang w:val="vi-VN"/>
-        </w:rPr>
-      </w:pPr>
-      <w:r>
-        <w:rPr>
-          <w:rFonts w:ascii="Times New Roman" w:hAnsi="Times New Roman" w:cs="Times New Roman"/>
-          <w:sz w:val="26"/>
-          <w:szCs w:val="26"/>
-          <w:lang w:val="vi-VN"/>
-        </w:rPr>
         <w:t>A new batch must not be started until the failed batch has been successfully recovered.</w:t>
       </w:r>
     </w:p>
     <w:p>
       <w:pPr>
+        <w:ind w:left="360"/>
+        <w:rPr>
+          <w:rFonts w:ascii="Times New Roman" w:hAnsi="Times New Roman" w:cs="Times New Roman"/>
+          <w:sz w:val="26"/>
+          <w:szCs w:val="26"/>
+          <w:lang w:val="vi-VN"/>
+        </w:rPr>
+      </w:pPr>
+    </w:p>
+    <w:p>
+      <w:pPr>
+        <w:ind w:left="360"/>
+        <w:rPr>
+          <w:rFonts w:ascii="Times New Roman" w:hAnsi="Times New Roman" w:cs="Times New Roman"/>
+          <w:sz w:val="26"/>
+          <w:szCs w:val="26"/>
+          <w:lang w:val="vi-VN"/>
+        </w:rPr>
+      </w:pPr>
+    </w:p>
+    <w:p>
+      <w:pPr>
+        <w:ind w:left="360"/>
+        <w:rPr>
+          <w:rFonts w:ascii="Times New Roman" w:hAnsi="Times New Roman" w:cs="Times New Roman"/>
+          <w:sz w:val="26"/>
+          <w:szCs w:val="26"/>
+          <w:lang w:val="vi-VN"/>
+        </w:rPr>
+      </w:pPr>
+    </w:p>
+    <w:p>
+      <w:pPr>
+        <w:ind w:left="360"/>
+        <w:rPr>
+          <w:rFonts w:ascii="Times New Roman" w:hAnsi="Times New Roman" w:cs="Times New Roman"/>
+          <w:sz w:val="26"/>
+          <w:szCs w:val="26"/>
+          <w:lang w:val="vi-VN"/>
+        </w:rPr>
+      </w:pPr>
+    </w:p>
+    <w:p>
+      <w:pPr>
+        <w:ind w:left="360"/>
+        <w:rPr>
+          <w:rFonts w:ascii="Times New Roman" w:hAnsi="Times New Roman" w:cs="Times New Roman"/>
+          <w:sz w:val="26"/>
+          <w:szCs w:val="26"/>
+          <w:lang w:val="vi-VN"/>
+        </w:rPr>
+      </w:pPr>
+    </w:p>
+    <w:p>
+      <w:pPr>
+        <w:ind w:firstLine="360"/>
         <w:rPr>
           <w:rFonts w:ascii="Times New Roman" w:hAnsi="Times New Roman" w:cs="Times New Roman"/>
           <w:b/>
@@ -9679,6 +9416,7 @@
           <w:szCs w:val="26"/>
           <w:lang w:val="vi-VN"/>
         </w:rPr>
+        <w:lastRenderedPageBreak/>
         <w:t xml:space="preserve">Example: </w:t>
       </w:r>
     </w:p>
@@ -12585,6 +12323,7 @@
   <w:style w:type="character" w:default="1" w:styleId="DefaultParagraphFont">
     <w:name w:val="Default Paragraph Font"/>
     <w:uiPriority w:val="1"/>
+    <w:semiHidden/>
     <w:unhideWhenUsed/>
   </w:style>
   <w:style w:type="table" w:default="1" w:styleId="TableNormal">

</xml_diff>